<commit_message>
getData e verify aggiornati
</commit_message>
<xml_diff>
--- a/3_Documentazione/Documentazione_CasaNote.docx
+++ b/3_Documentazione/Documentazione_CasaNote.docx
@@ -10,6 +10,8 @@
           <w:tab w:val="right" w:leader="dot" w:pos="9628"/>
         </w:tabs>
       </w:pPr>
+      <w:bookmarkStart w:id="0" w:name="_GoBack"/>
+      <w:bookmarkEnd w:id="0"/>
     </w:p>
     <w:p>
       <w:pPr>
@@ -123,7 +125,7 @@
         <w:rPr>
           <w:noProof/>
         </w:rPr>
-        <w:instrText xml:space="preserve"> PAGEREF _Toc193894916 \h </w:instrText>
+        <w:instrText xml:space="preserve"> PAGEREF _Toc194492654 \h </w:instrText>
       </w:r>
       <w:r>
         <w:rPr>
@@ -202,7 +204,7 @@
         <w:rPr>
           <w:noProof/>
         </w:rPr>
-        <w:instrText xml:space="preserve"> PAGEREF _Toc193894917 \h </w:instrText>
+        <w:instrText xml:space="preserve"> PAGEREF _Toc194492655 \h </w:instrText>
       </w:r>
       <w:r>
         <w:rPr>
@@ -281,7 +283,7 @@
         <w:rPr>
           <w:noProof/>
         </w:rPr>
-        <w:instrText xml:space="preserve"> PAGEREF _Toc193894918 \h </w:instrText>
+        <w:instrText xml:space="preserve"> PAGEREF _Toc194492656 \h </w:instrText>
       </w:r>
       <w:r>
         <w:rPr>
@@ -360,7 +362,7 @@
         <w:rPr>
           <w:noProof/>
         </w:rPr>
-        <w:instrText xml:space="preserve"> PAGEREF _Toc193894919 \h </w:instrText>
+        <w:instrText xml:space="preserve"> PAGEREF _Toc194492657 \h </w:instrText>
       </w:r>
       <w:r>
         <w:rPr>
@@ -439,7 +441,7 @@
         <w:rPr>
           <w:noProof/>
         </w:rPr>
-        <w:instrText xml:space="preserve"> PAGEREF _Toc193894920 \h </w:instrText>
+        <w:instrText xml:space="preserve"> PAGEREF _Toc194492658 \h </w:instrText>
       </w:r>
       <w:r>
         <w:rPr>
@@ -518,7 +520,7 @@
         <w:rPr>
           <w:noProof/>
         </w:rPr>
-        <w:instrText xml:space="preserve"> PAGEREF _Toc193894921 \h </w:instrText>
+        <w:instrText xml:space="preserve"> PAGEREF _Toc194492659 \h </w:instrText>
       </w:r>
       <w:r>
         <w:rPr>
@@ -597,7 +599,7 @@
         <w:rPr>
           <w:noProof/>
         </w:rPr>
-        <w:instrText xml:space="preserve"> PAGEREF _Toc193894922 \h </w:instrText>
+        <w:instrText xml:space="preserve"> PAGEREF _Toc194492660 \h </w:instrText>
       </w:r>
       <w:r>
         <w:rPr>
@@ -676,7 +678,7 @@
         <w:rPr>
           <w:noProof/>
         </w:rPr>
-        <w:instrText xml:space="preserve"> PAGEREF _Toc193894923 \h </w:instrText>
+        <w:instrText xml:space="preserve"> PAGEREF _Toc194492661 \h </w:instrText>
       </w:r>
       <w:r>
         <w:rPr>
@@ -755,7 +757,7 @@
         <w:rPr>
           <w:noProof/>
         </w:rPr>
-        <w:instrText xml:space="preserve"> PAGEREF _Toc193894924 \h </w:instrText>
+        <w:instrText xml:space="preserve"> PAGEREF _Toc194492662 \h </w:instrText>
       </w:r>
       <w:r>
         <w:rPr>
@@ -834,7 +836,7 @@
         <w:rPr>
           <w:noProof/>
         </w:rPr>
-        <w:instrText xml:space="preserve"> PAGEREF _Toc193894925 \h </w:instrText>
+        <w:instrText xml:space="preserve"> PAGEREF _Toc194492663 \h </w:instrText>
       </w:r>
       <w:r>
         <w:rPr>
@@ -913,7 +915,7 @@
         <w:rPr>
           <w:noProof/>
         </w:rPr>
-        <w:instrText xml:space="preserve"> PAGEREF _Toc193894926 \h </w:instrText>
+        <w:instrText xml:space="preserve"> PAGEREF _Toc194492664 \h </w:instrText>
       </w:r>
       <w:r>
         <w:rPr>
@@ -930,7 +932,7 @@
         <w:rPr>
           <w:noProof/>
         </w:rPr>
-        <w:t>1</w:t>
+        <w:t>11</w:t>
       </w:r>
       <w:r>
         <w:rPr>
@@ -992,7 +994,7 @@
         <w:rPr>
           <w:noProof/>
         </w:rPr>
-        <w:instrText xml:space="preserve"> PAGEREF _Toc193894927 \h </w:instrText>
+        <w:instrText xml:space="preserve"> PAGEREF _Toc194492665 \h </w:instrText>
       </w:r>
       <w:r>
         <w:rPr>
@@ -1009,7 +1011,7 @@
         <w:rPr>
           <w:noProof/>
         </w:rPr>
-        <w:t>1</w:t>
+        <w:t>11</w:t>
       </w:r>
       <w:r>
         <w:rPr>
@@ -1071,7 +1073,7 @@
         <w:rPr>
           <w:noProof/>
         </w:rPr>
-        <w:instrText xml:space="preserve"> PAGEREF _Toc193894928 \h </w:instrText>
+        <w:instrText xml:space="preserve"> PAGEREF _Toc194492666 \h </w:instrText>
       </w:r>
       <w:r>
         <w:rPr>
@@ -1088,7 +1090,7 @@
         <w:rPr>
           <w:noProof/>
         </w:rPr>
-        <w:t>1</w:t>
+        <w:t>11</w:t>
       </w:r>
       <w:r>
         <w:rPr>
@@ -1150,7 +1152,7 @@
         <w:rPr>
           <w:noProof/>
         </w:rPr>
-        <w:instrText xml:space="preserve"> PAGEREF _Toc193894929 \h </w:instrText>
+        <w:instrText xml:space="preserve"> PAGEREF _Toc194492667 \h </w:instrText>
       </w:r>
       <w:r>
         <w:rPr>
@@ -1167,7 +1169,7 @@
         <w:rPr>
           <w:noProof/>
         </w:rPr>
-        <w:t>2</w:t>
+        <w:t>12</w:t>
       </w:r>
       <w:r>
         <w:rPr>
@@ -1229,7 +1231,7 @@
         <w:rPr>
           <w:noProof/>
         </w:rPr>
-        <w:instrText xml:space="preserve"> PAGEREF _Toc193894930 \h </w:instrText>
+        <w:instrText xml:space="preserve"> PAGEREF _Toc194492668 \h </w:instrText>
       </w:r>
       <w:r>
         <w:rPr>
@@ -1246,7 +1248,7 @@
         <w:rPr>
           <w:noProof/>
         </w:rPr>
-        <w:t>2</w:t>
+        <w:t>12</w:t>
       </w:r>
       <w:r>
         <w:rPr>
@@ -1308,7 +1310,7 @@
         <w:rPr>
           <w:noProof/>
         </w:rPr>
-        <w:instrText xml:space="preserve"> PAGEREF _Toc193894931 \h </w:instrText>
+        <w:instrText xml:space="preserve"> PAGEREF _Toc194492669 \h </w:instrText>
       </w:r>
       <w:r>
         <w:rPr>
@@ -1325,7 +1327,7 @@
         <w:rPr>
           <w:noProof/>
         </w:rPr>
-        <w:t>3</w:t>
+        <w:t>13</w:t>
       </w:r>
       <w:r>
         <w:rPr>
@@ -1387,7 +1389,7 @@
         <w:rPr>
           <w:noProof/>
         </w:rPr>
-        <w:instrText xml:space="preserve"> PAGEREF _Toc193894932 \h </w:instrText>
+        <w:instrText xml:space="preserve"> PAGEREF _Toc194492670 \h </w:instrText>
       </w:r>
       <w:r>
         <w:rPr>
@@ -1404,7 +1406,7 @@
         <w:rPr>
           <w:noProof/>
         </w:rPr>
-        <w:t>6</w:t>
+        <w:t>16</w:t>
       </w:r>
       <w:r>
         <w:rPr>
@@ -1466,7 +1468,7 @@
         <w:rPr>
           <w:noProof/>
         </w:rPr>
-        <w:instrText xml:space="preserve"> PAGEREF _Toc193894933 \h </w:instrText>
+        <w:instrText xml:space="preserve"> PAGEREF _Toc194492671 \h </w:instrText>
       </w:r>
       <w:r>
         <w:rPr>
@@ -1483,7 +1485,7 @@
         <w:rPr>
           <w:noProof/>
         </w:rPr>
-        <w:t>7</w:t>
+        <w:t>17</w:t>
       </w:r>
       <w:r>
         <w:rPr>
@@ -1545,7 +1547,7 @@
         <w:rPr>
           <w:noProof/>
         </w:rPr>
-        <w:instrText xml:space="preserve"> PAGEREF _Toc193894934 \h </w:instrText>
+        <w:instrText xml:space="preserve"> PAGEREF _Toc194492672 \h </w:instrText>
       </w:r>
       <w:r>
         <w:rPr>
@@ -1562,7 +1564,7 @@
         <w:rPr>
           <w:noProof/>
         </w:rPr>
-        <w:t>7</w:t>
+        <w:t>17</w:t>
       </w:r>
       <w:r>
         <w:rPr>
@@ -1624,7 +1626,7 @@
         <w:rPr>
           <w:noProof/>
         </w:rPr>
-        <w:instrText xml:space="preserve"> PAGEREF _Toc193894935 \h </w:instrText>
+        <w:instrText xml:space="preserve"> PAGEREF _Toc194492673 \h </w:instrText>
       </w:r>
       <w:r>
         <w:rPr>
@@ -1641,7 +1643,7 @@
         <w:rPr>
           <w:noProof/>
         </w:rPr>
-        <w:t>8</w:t>
+        <w:t>18</w:t>
       </w:r>
       <w:r>
         <w:rPr>
@@ -1703,7 +1705,7 @@
         <w:rPr>
           <w:noProof/>
         </w:rPr>
-        <w:instrText xml:space="preserve"> PAGEREF _Toc193894936 \h </w:instrText>
+        <w:instrText xml:space="preserve"> PAGEREF _Toc194492674 \h </w:instrText>
       </w:r>
       <w:r>
         <w:rPr>
@@ -1720,7 +1722,7 @@
         <w:rPr>
           <w:noProof/>
         </w:rPr>
-        <w:t>9</w:t>
+        <w:t>19</w:t>
       </w:r>
       <w:r>
         <w:rPr>
@@ -1782,7 +1784,7 @@
         <w:rPr>
           <w:noProof/>
         </w:rPr>
-        <w:instrText xml:space="preserve"> PAGEREF _Toc193894937 \h </w:instrText>
+        <w:instrText xml:space="preserve"> PAGEREF _Toc194492675 \h </w:instrText>
       </w:r>
       <w:r>
         <w:rPr>
@@ -1799,7 +1801,7 @@
         <w:rPr>
           <w:noProof/>
         </w:rPr>
-        <w:t>10</w:t>
+        <w:t>20</w:t>
       </w:r>
       <w:r>
         <w:rPr>
@@ -1861,7 +1863,7 @@
         <w:rPr>
           <w:noProof/>
         </w:rPr>
-        <w:instrText xml:space="preserve"> PAGEREF _Toc193894938 \h </w:instrText>
+        <w:instrText xml:space="preserve"> PAGEREF _Toc194492676 \h </w:instrText>
       </w:r>
       <w:r>
         <w:rPr>
@@ -1878,7 +1880,7 @@
         <w:rPr>
           <w:noProof/>
         </w:rPr>
-        <w:t>11</w:t>
+        <w:t>21</w:t>
       </w:r>
       <w:r>
         <w:rPr>
@@ -1940,7 +1942,7 @@
         <w:rPr>
           <w:noProof/>
         </w:rPr>
-        <w:instrText xml:space="preserve"> PAGEREF _Toc193894939 \h </w:instrText>
+        <w:instrText xml:space="preserve"> PAGEREF _Toc194492677 \h </w:instrText>
       </w:r>
       <w:r>
         <w:rPr>
@@ -1957,7 +1959,7 @@
         <w:rPr>
           <w:noProof/>
         </w:rPr>
-        <w:t>11</w:t>
+        <w:t>21</w:t>
       </w:r>
       <w:r>
         <w:rPr>
@@ -2019,7 +2021,7 @@
         <w:rPr>
           <w:noProof/>
         </w:rPr>
-        <w:instrText xml:space="preserve"> PAGEREF _Toc193894940 \h </w:instrText>
+        <w:instrText xml:space="preserve"> PAGEREF _Toc194492678 \h </w:instrText>
       </w:r>
       <w:r>
         <w:rPr>
@@ -2036,7 +2038,7 @@
         <w:rPr>
           <w:noProof/>
         </w:rPr>
-        <w:t>12</w:t>
+        <w:t>22</w:t>
       </w:r>
       <w:r>
         <w:rPr>
@@ -2098,7 +2100,7 @@
         <w:rPr>
           <w:noProof/>
         </w:rPr>
-        <w:instrText xml:space="preserve"> PAGEREF _Toc193894941 \h </w:instrText>
+        <w:instrText xml:space="preserve"> PAGEREF _Toc194492679 \h </w:instrText>
       </w:r>
       <w:r>
         <w:rPr>
@@ -2115,7 +2117,7 @@
         <w:rPr>
           <w:noProof/>
         </w:rPr>
-        <w:t>12</w:t>
+        <w:t>22</w:t>
       </w:r>
       <w:r>
         <w:rPr>
@@ -2177,7 +2179,7 @@
         <w:rPr>
           <w:noProof/>
         </w:rPr>
-        <w:instrText xml:space="preserve"> PAGEREF _Toc193894942 \h </w:instrText>
+        <w:instrText xml:space="preserve"> PAGEREF _Toc194492680 \h </w:instrText>
       </w:r>
       <w:r>
         <w:rPr>
@@ -2194,7 +2196,7 @@
         <w:rPr>
           <w:noProof/>
         </w:rPr>
-        <w:t>12</w:t>
+        <w:t>22</w:t>
       </w:r>
       <w:r>
         <w:rPr>
@@ -2256,7 +2258,7 @@
         <w:rPr>
           <w:noProof/>
         </w:rPr>
-        <w:instrText xml:space="preserve"> PAGEREF _Toc193894943 \h </w:instrText>
+        <w:instrText xml:space="preserve"> PAGEREF _Toc194492681 \h </w:instrText>
       </w:r>
       <w:r>
         <w:rPr>
@@ -2273,7 +2275,7 @@
         <w:rPr>
           <w:noProof/>
         </w:rPr>
-        <w:t>15</w:t>
+        <w:t>25</w:t>
       </w:r>
       <w:r>
         <w:rPr>
@@ -2335,7 +2337,7 @@
         <w:rPr>
           <w:noProof/>
         </w:rPr>
-        <w:instrText xml:space="preserve"> PAGEREF _Toc193894944 \h </w:instrText>
+        <w:instrText xml:space="preserve"> PAGEREF _Toc194492682 \h </w:instrText>
       </w:r>
       <w:r>
         <w:rPr>
@@ -2352,7 +2354,7 @@
         <w:rPr>
           <w:noProof/>
         </w:rPr>
-        <w:t>15</w:t>
+        <w:t>25</w:t>
       </w:r>
       <w:r>
         <w:rPr>
@@ -2414,7 +2416,7 @@
         <w:rPr>
           <w:noProof/>
         </w:rPr>
-        <w:instrText xml:space="preserve"> PAGEREF _Toc193894945 \h </w:instrText>
+        <w:instrText xml:space="preserve"> PAGEREF _Toc194492683 \h </w:instrText>
       </w:r>
       <w:r>
         <w:rPr>
@@ -2431,7 +2433,7 @@
         <w:rPr>
           <w:noProof/>
         </w:rPr>
-        <w:t>15</w:t>
+        <w:t>25</w:t>
       </w:r>
       <w:r>
         <w:rPr>
@@ -2493,7 +2495,7 @@
         <w:rPr>
           <w:noProof/>
         </w:rPr>
-        <w:instrText xml:space="preserve"> PAGEREF _Toc193894946 \h </w:instrText>
+        <w:instrText xml:space="preserve"> PAGEREF _Toc194492684 \h </w:instrText>
       </w:r>
       <w:r>
         <w:rPr>
@@ -2510,7 +2512,7 @@
         <w:rPr>
           <w:noProof/>
         </w:rPr>
-        <w:t>16</w:t>
+        <w:t>26</w:t>
       </w:r>
       <w:r>
         <w:rPr>
@@ -2554,15 +2556,7 @@
         <w:rPr>
           <w:noProof/>
         </w:rPr>
-        <w:t>Sviluppi</w:t>
-      </w:r>
-      <w:bookmarkStart w:id="0" w:name="_GoBack"/>
-      <w:bookmarkEnd w:id="0"/>
-      <w:r>
-        <w:rPr>
-          <w:noProof/>
-        </w:rPr>
-        <w:t xml:space="preserve"> futuri</w:t>
+        <w:t>Sviluppi futuri</w:t>
       </w:r>
       <w:r>
         <w:rPr>
@@ -2580,7 +2574,7 @@
         <w:rPr>
           <w:noProof/>
         </w:rPr>
-        <w:instrText xml:space="preserve"> PAGEREF _Toc193894947 \h </w:instrText>
+        <w:instrText xml:space="preserve"> PAGEREF _Toc194492685 \h </w:instrText>
       </w:r>
       <w:r>
         <w:rPr>
@@ -2597,7 +2591,7 @@
         <w:rPr>
           <w:noProof/>
         </w:rPr>
-        <w:t>16</w:t>
+        <w:t>26</w:t>
       </w:r>
       <w:r>
         <w:rPr>
@@ -2659,7 +2653,7 @@
         <w:rPr>
           <w:noProof/>
         </w:rPr>
-        <w:instrText xml:space="preserve"> PAGEREF _Toc193894948 \h </w:instrText>
+        <w:instrText xml:space="preserve"> PAGEREF _Toc194492686 \h </w:instrText>
       </w:r>
       <w:r>
         <w:rPr>
@@ -2676,7 +2670,7 @@
         <w:rPr>
           <w:noProof/>
         </w:rPr>
-        <w:t>16</w:t>
+        <w:t>26</w:t>
       </w:r>
       <w:r>
         <w:rPr>
@@ -2738,7 +2732,7 @@
         <w:rPr>
           <w:noProof/>
         </w:rPr>
-        <w:instrText xml:space="preserve"> PAGEREF _Toc193894949 \h </w:instrText>
+        <w:instrText xml:space="preserve"> PAGEREF _Toc194492687 \h </w:instrText>
       </w:r>
       <w:r>
         <w:rPr>
@@ -2755,7 +2749,7 @@
         <w:rPr>
           <w:noProof/>
         </w:rPr>
-        <w:t>16</w:t>
+        <w:t>26</w:t>
       </w:r>
       <w:r>
         <w:rPr>
@@ -2817,7 +2811,7 @@
         <w:rPr>
           <w:noProof/>
         </w:rPr>
-        <w:instrText xml:space="preserve"> PAGEREF _Toc193894950 \h </w:instrText>
+        <w:instrText xml:space="preserve"> PAGEREF _Toc194492688 \h </w:instrText>
       </w:r>
       <w:r>
         <w:rPr>
@@ -2834,7 +2828,7 @@
         <w:rPr>
           <w:noProof/>
         </w:rPr>
-        <w:t>17</w:t>
+        <w:t>27</w:t>
       </w:r>
       <w:r>
         <w:rPr>
@@ -2896,7 +2890,7 @@
         <w:rPr>
           <w:noProof/>
         </w:rPr>
-        <w:instrText xml:space="preserve"> PAGEREF _Toc193894951 \h </w:instrText>
+        <w:instrText xml:space="preserve"> PAGEREF _Toc194492689 \h </w:instrText>
       </w:r>
       <w:r>
         <w:rPr>
@@ -2913,7 +2907,7 @@
         <w:rPr>
           <w:noProof/>
         </w:rPr>
-        <w:t>17</w:t>
+        <w:t>27</w:t>
       </w:r>
       <w:r>
         <w:rPr>
@@ -2975,7 +2969,7 @@
         <w:rPr>
           <w:noProof/>
         </w:rPr>
-        <w:instrText xml:space="preserve"> PAGEREF _Toc193894952 \h </w:instrText>
+        <w:instrText xml:space="preserve"> PAGEREF _Toc194492690 \h </w:instrText>
       </w:r>
       <w:r>
         <w:rPr>
@@ -2992,7 +2986,7 @@
         <w:rPr>
           <w:noProof/>
         </w:rPr>
-        <w:t>17</w:t>
+        <w:t>27</w:t>
       </w:r>
       <w:r>
         <w:rPr>
@@ -3054,7 +3048,7 @@
         <w:rPr>
           <w:noProof/>
         </w:rPr>
-        <w:instrText xml:space="preserve"> PAGEREF _Toc193894953 \h </w:instrText>
+        <w:instrText xml:space="preserve"> PAGEREF _Toc194492691 \h </w:instrText>
       </w:r>
       <w:r>
         <w:rPr>
@@ -3071,7 +3065,7 @@
         <w:rPr>
           <w:noProof/>
         </w:rPr>
-        <w:t>17</w:t>
+        <w:t>27</w:t>
       </w:r>
       <w:r>
         <w:rPr>
@@ -3133,7 +3127,7 @@
         <w:rPr>
           <w:noProof/>
         </w:rPr>
-        <w:instrText xml:space="preserve"> PAGEREF _Toc193894954 \h </w:instrText>
+        <w:instrText xml:space="preserve"> PAGEREF _Toc194492692 \h </w:instrText>
       </w:r>
       <w:r>
         <w:rPr>
@@ -3150,7 +3144,7 @@
         <w:rPr>
           <w:noProof/>
         </w:rPr>
-        <w:t>17</w:t>
+        <w:t>27</w:t>
       </w:r>
       <w:r>
         <w:rPr>
@@ -3173,7 +3167,7 @@
       <w:r>
         <w:br w:type="page"/>
       </w:r>
-      <w:bookmarkStart w:id="1" w:name="_Toc193894916"/>
+      <w:bookmarkStart w:id="1" w:name="_Toc194492654"/>
       <w:r>
         <w:lastRenderedPageBreak/>
         <w:t>Introduzione</w:t>
@@ -3187,7 +3181,7 @@
           <w:lang w:val="it-CH"/>
         </w:rPr>
       </w:pPr>
-      <w:bookmarkStart w:id="2" w:name="_Toc193894917"/>
+      <w:bookmarkStart w:id="2" w:name="_Toc194492655"/>
       <w:r>
         <w:rPr>
           <w:lang w:val="it-CH"/>
@@ -3291,7 +3285,7 @@
           <w:lang w:val="it-CH"/>
         </w:rPr>
       </w:pPr>
-      <w:bookmarkStart w:id="3" w:name="_Toc193894918"/>
+      <w:bookmarkStart w:id="3" w:name="_Toc194492656"/>
       <w:r>
         <w:rPr>
           <w:lang w:val="it-CH"/>
@@ -4223,7 +4217,7 @@
           <w:lang w:val="it-CH"/>
         </w:rPr>
       </w:pPr>
-      <w:bookmarkStart w:id="4" w:name="_Toc193894919"/>
+      <w:bookmarkStart w:id="4" w:name="_Toc194492657"/>
       <w:r>
         <w:rPr>
           <w:lang w:val="it-CH"/>
@@ -4273,7 +4267,7 @@
       <w:r>
         <w:br w:type="page"/>
       </w:r>
-      <w:bookmarkStart w:id="5" w:name="_Toc193894920"/>
+      <w:bookmarkStart w:id="5" w:name="_Toc194492658"/>
       <w:r>
         <w:lastRenderedPageBreak/>
         <w:t>Analisi</w:t>
@@ -4287,7 +4281,7 @@
           <w:lang w:val="it-CH"/>
         </w:rPr>
       </w:pPr>
-      <w:bookmarkStart w:id="6" w:name="_Toc193894921"/>
+      <w:bookmarkStart w:id="6" w:name="_Toc194492659"/>
       <w:r>
         <w:rPr>
           <w:lang w:val="it-CH"/>
@@ -4497,7 +4491,7 @@
           <w:lang w:val="it-CH"/>
         </w:rPr>
       </w:pPr>
-      <w:bookmarkStart w:id="7" w:name="_Toc193894922"/>
+      <w:bookmarkStart w:id="7" w:name="_Toc194492660"/>
       <w:r>
         <w:rPr>
           <w:lang w:val="it-CH"/>
@@ -4508,10 +4502,7 @@
     </w:p>
     <w:p>
       <w:r>
-        <w:t>DA FARE</w:t>
-      </w:r>
-      <w:r>
-        <w:t xml:space="preserve"> piccolo testo descrittivo</w:t>
+        <w:t>Il sito web multiutente consente agli utenti di registrarsi, autenticarsi e gestire un blocco note digitale. Le funzionalità includono scrittura, modifica, salvataggio, registrazione audio, importazione di file e esportazione in ZIP. Il sito sarà responsive, con un'interfaccia semplice tramite Bootstrap e tutti i dati cifrati nel database. È previsto l'uso di CAPTCHA nella registrazione e l'hosting dovrà supportare Java 3.3.6.</w:t>
       </w:r>
     </w:p>
     <w:p/>
@@ -5117,6 +5108,11 @@
       <w:bookmarkEnd w:id="8"/>
     </w:tbl>
     <w:p/>
+    <w:p>
+      <w:r>
+        <w:br w:type="page"/>
+      </w:r>
+    </w:p>
     <w:tbl>
       <w:tblPr>
         <w:tblW w:w="9580" w:type="dxa"/>
@@ -5170,6 +5166,7 @@
                 <w:sz w:val="16"/>
                 <w:szCs w:val="16"/>
               </w:rPr>
+              <w:lastRenderedPageBreak/>
               <w:t>ID: REQ-03</w:t>
             </w:r>
           </w:p>
@@ -6617,303 +6614,6 @@
       </w:tr>
     </w:tbl>
     <w:p/>
-    <w:tbl>
-      <w:tblPr>
-        <w:tblW w:w="9580" w:type="dxa"/>
-        <w:tblCellSpacing w:w="0" w:type="dxa"/>
-        <w:tblInd w:w="-8" w:type="dxa"/>
-        <w:tblBorders>
-          <w:top w:val="outset" w:sz="6" w:space="0" w:color="000000"/>
-          <w:left w:val="outset" w:sz="6" w:space="0" w:color="000000"/>
-          <w:bottom w:val="outset" w:sz="6" w:space="0" w:color="000000"/>
-          <w:right w:val="outset" w:sz="6" w:space="0" w:color="000000"/>
-        </w:tblBorders>
-        <w:tblCellMar>
-          <w:top w:w="60" w:type="dxa"/>
-          <w:left w:w="60" w:type="dxa"/>
-          <w:bottom w:w="60" w:type="dxa"/>
-          <w:right w:w="60" w:type="dxa"/>
-        </w:tblCellMar>
-        <w:tblLook w:val="00A0" w:firstRow="1" w:lastRow="0" w:firstColumn="1" w:lastColumn="0" w:noHBand="0" w:noVBand="0"/>
-      </w:tblPr>
-      <w:tblGrid>
-        <w:gridCol w:w="1895"/>
-        <w:gridCol w:w="7685"/>
-      </w:tblGrid>
-      <w:tr>
-        <w:trPr>
-          <w:trHeight w:val="251"/>
-          <w:tblCellSpacing w:w="0" w:type="dxa"/>
-        </w:trPr>
-        <w:tc>
-          <w:tcPr>
-            <w:tcW w:w="9580" w:type="dxa"/>
-            <w:gridSpan w:val="2"/>
-            <w:tcBorders>
-              <w:top w:val="outset" w:sz="6" w:space="0" w:color="000000"/>
-              <w:bottom w:val="outset" w:sz="6" w:space="0" w:color="000000"/>
-            </w:tcBorders>
-          </w:tcPr>
-          <w:p>
-            <w:pPr>
-              <w:spacing w:before="100" w:beforeAutospacing="1"/>
-              <w:jc w:val="center"/>
-              <w:rPr>
-                <w:b/>
-                <w:sz w:val="16"/>
-                <w:szCs w:val="16"/>
-              </w:rPr>
-            </w:pPr>
-            <w:r>
-              <w:rPr>
-                <w:b/>
-                <w:sz w:val="16"/>
-                <w:szCs w:val="16"/>
-              </w:rPr>
-              <w:t>ID: REQ-0</w:t>
-            </w:r>
-            <w:r>
-              <w:rPr>
-                <w:b/>
-                <w:sz w:val="16"/>
-                <w:szCs w:val="16"/>
-              </w:rPr>
-              <w:t>6</w:t>
-            </w:r>
-          </w:p>
-        </w:tc>
-      </w:tr>
-      <w:tr>
-        <w:trPr>
-          <w:tblCellSpacing w:w="0" w:type="dxa"/>
-        </w:trPr>
-        <w:tc>
-          <w:tcPr>
-            <w:tcW w:w="1895" w:type="dxa"/>
-            <w:tcBorders>
-              <w:top w:val="outset" w:sz="6" w:space="0" w:color="000000"/>
-              <w:bottom w:val="outset" w:sz="6" w:space="0" w:color="000000"/>
-              <w:right w:val="outset" w:sz="6" w:space="0" w:color="000000"/>
-            </w:tcBorders>
-          </w:tcPr>
-          <w:p>
-            <w:pPr>
-              <w:spacing w:before="100" w:beforeAutospacing="1"/>
-              <w:rPr>
-                <w:b/>
-                <w:sz w:val="16"/>
-                <w:szCs w:val="16"/>
-              </w:rPr>
-            </w:pPr>
-            <w:r>
-              <w:rPr>
-                <w:b/>
-                <w:sz w:val="16"/>
-                <w:szCs w:val="16"/>
-              </w:rPr>
-              <w:t>Nome</w:t>
-            </w:r>
-          </w:p>
-        </w:tc>
-        <w:tc>
-          <w:tcPr>
-            <w:tcW w:w="7685" w:type="dxa"/>
-            <w:tcBorders>
-              <w:top w:val="outset" w:sz="6" w:space="0" w:color="000000"/>
-              <w:left w:val="outset" w:sz="6" w:space="0" w:color="000000"/>
-              <w:bottom w:val="outset" w:sz="6" w:space="0" w:color="000000"/>
-            </w:tcBorders>
-          </w:tcPr>
-          <w:p>
-            <w:pPr>
-              <w:spacing w:before="100" w:beforeAutospacing="1"/>
-              <w:rPr>
-                <w:sz w:val="16"/>
-                <w:szCs w:val="16"/>
-              </w:rPr>
-            </w:pPr>
-            <w:r>
-              <w:rPr>
-                <w:sz w:val="16"/>
-                <w:szCs w:val="16"/>
-              </w:rPr>
-              <w:t>Sito deve essere responsive</w:t>
-            </w:r>
-          </w:p>
-        </w:tc>
-      </w:tr>
-      <w:tr>
-        <w:trPr>
-          <w:tblCellSpacing w:w="0" w:type="dxa"/>
-        </w:trPr>
-        <w:tc>
-          <w:tcPr>
-            <w:tcW w:w="1895" w:type="dxa"/>
-            <w:tcBorders>
-              <w:top w:val="outset" w:sz="6" w:space="0" w:color="000000"/>
-              <w:bottom w:val="outset" w:sz="6" w:space="0" w:color="000000"/>
-              <w:right w:val="outset" w:sz="6" w:space="0" w:color="000000"/>
-            </w:tcBorders>
-          </w:tcPr>
-          <w:p>
-            <w:pPr>
-              <w:spacing w:before="100" w:beforeAutospacing="1"/>
-              <w:rPr>
-                <w:b/>
-                <w:sz w:val="16"/>
-                <w:szCs w:val="16"/>
-              </w:rPr>
-            </w:pPr>
-            <w:r>
-              <w:rPr>
-                <w:b/>
-                <w:sz w:val="16"/>
-                <w:szCs w:val="16"/>
-              </w:rPr>
-              <w:t>Priorità</w:t>
-            </w:r>
-          </w:p>
-        </w:tc>
-        <w:tc>
-          <w:tcPr>
-            <w:tcW w:w="7685" w:type="dxa"/>
-            <w:tcBorders>
-              <w:top w:val="outset" w:sz="6" w:space="0" w:color="000000"/>
-              <w:left w:val="outset" w:sz="6" w:space="0" w:color="000000"/>
-              <w:bottom w:val="outset" w:sz="6" w:space="0" w:color="000000"/>
-            </w:tcBorders>
-          </w:tcPr>
-          <w:p>
-            <w:pPr>
-              <w:spacing w:before="100" w:beforeAutospacing="1"/>
-              <w:rPr>
-                <w:sz w:val="16"/>
-                <w:szCs w:val="16"/>
-              </w:rPr>
-            </w:pPr>
-            <w:r>
-              <w:rPr>
-                <w:sz w:val="16"/>
-                <w:szCs w:val="16"/>
-              </w:rPr>
-              <w:t>1</w:t>
-            </w:r>
-          </w:p>
-        </w:tc>
-      </w:tr>
-      <w:tr>
-        <w:trPr>
-          <w:tblCellSpacing w:w="0" w:type="dxa"/>
-        </w:trPr>
-        <w:tc>
-          <w:tcPr>
-            <w:tcW w:w="1895" w:type="dxa"/>
-            <w:tcBorders>
-              <w:top w:val="outset" w:sz="6" w:space="0" w:color="000000"/>
-              <w:bottom w:val="outset" w:sz="6" w:space="0" w:color="000000"/>
-              <w:right w:val="outset" w:sz="6" w:space="0" w:color="000000"/>
-            </w:tcBorders>
-          </w:tcPr>
-          <w:p>
-            <w:pPr>
-              <w:spacing w:before="100" w:beforeAutospacing="1"/>
-              <w:rPr>
-                <w:b/>
-                <w:sz w:val="16"/>
-                <w:szCs w:val="16"/>
-              </w:rPr>
-            </w:pPr>
-            <w:r>
-              <w:rPr>
-                <w:b/>
-                <w:sz w:val="16"/>
-                <w:szCs w:val="16"/>
-              </w:rPr>
-              <w:t>Versione</w:t>
-            </w:r>
-          </w:p>
-        </w:tc>
-        <w:tc>
-          <w:tcPr>
-            <w:tcW w:w="7685" w:type="dxa"/>
-            <w:tcBorders>
-              <w:top w:val="outset" w:sz="6" w:space="0" w:color="000000"/>
-              <w:left w:val="outset" w:sz="6" w:space="0" w:color="000000"/>
-              <w:bottom w:val="outset" w:sz="6" w:space="0" w:color="000000"/>
-            </w:tcBorders>
-          </w:tcPr>
-          <w:p>
-            <w:pPr>
-              <w:spacing w:before="100" w:beforeAutospacing="1"/>
-              <w:rPr>
-                <w:sz w:val="16"/>
-                <w:szCs w:val="16"/>
-              </w:rPr>
-            </w:pPr>
-            <w:r>
-              <w:rPr>
-                <w:sz w:val="16"/>
-                <w:szCs w:val="16"/>
-              </w:rPr>
-              <w:t>1.0</w:t>
-            </w:r>
-          </w:p>
-        </w:tc>
-      </w:tr>
-      <w:tr>
-        <w:trPr>
-          <w:tblCellSpacing w:w="0" w:type="dxa"/>
-        </w:trPr>
-        <w:tc>
-          <w:tcPr>
-            <w:tcW w:w="1895" w:type="dxa"/>
-            <w:tcBorders>
-              <w:top w:val="outset" w:sz="6" w:space="0" w:color="000000"/>
-              <w:bottom w:val="outset" w:sz="6" w:space="0" w:color="000000"/>
-              <w:right w:val="outset" w:sz="6" w:space="0" w:color="000000"/>
-            </w:tcBorders>
-          </w:tcPr>
-          <w:p>
-            <w:pPr>
-              <w:spacing w:before="100" w:beforeAutospacing="1"/>
-              <w:rPr>
-                <w:b/>
-                <w:sz w:val="16"/>
-                <w:szCs w:val="16"/>
-              </w:rPr>
-            </w:pPr>
-            <w:r>
-              <w:rPr>
-                <w:b/>
-                <w:sz w:val="16"/>
-                <w:szCs w:val="16"/>
-              </w:rPr>
-              <w:t>Note</w:t>
-            </w:r>
-          </w:p>
-        </w:tc>
-        <w:tc>
-          <w:tcPr>
-            <w:tcW w:w="7685" w:type="dxa"/>
-            <w:tcBorders>
-              <w:top w:val="outset" w:sz="6" w:space="0" w:color="000000"/>
-              <w:left w:val="outset" w:sz="6" w:space="0" w:color="000000"/>
-              <w:bottom w:val="outset" w:sz="6" w:space="0" w:color="000000"/>
-            </w:tcBorders>
-          </w:tcPr>
-          <w:p>
-            <w:pPr>
-              <w:spacing w:before="100" w:beforeAutospacing="1"/>
-              <w:rPr>
-                <w:sz w:val="16"/>
-                <w:szCs w:val="16"/>
-              </w:rPr>
-            </w:pPr>
-          </w:p>
-        </w:tc>
-      </w:tr>
-    </w:tbl>
-    <w:p/>
     <w:p>
       <w:r>
         <w:br w:type="page"/>
@@ -6973,7 +6673,15 @@
                 <w:szCs w:val="16"/>
               </w:rPr>
               <w:lastRenderedPageBreak/>
-              <w:t>ID: REQ-07</w:t>
+              <w:t>ID: REQ-0</w:t>
+            </w:r>
+            <w:r>
+              <w:rPr>
+                <w:b/>
+                <w:sz w:val="16"/>
+                <w:szCs w:val="16"/>
+              </w:rPr>
+              <w:t>6</w:t>
             </w:r>
           </w:p>
         </w:tc>
@@ -7032,23 +6740,7 @@
                 <w:sz w:val="16"/>
                 <w:szCs w:val="16"/>
               </w:rPr>
-              <w:t xml:space="preserve">Dati nel </w:t>
-            </w:r>
-            <w:proofErr w:type="spellStart"/>
-            <w:r>
-              <w:rPr>
-                <w:sz w:val="16"/>
-                <w:szCs w:val="16"/>
-              </w:rPr>
-              <w:t>db</w:t>
-            </w:r>
-            <w:proofErr w:type="spellEnd"/>
-            <w:r>
-              <w:rPr>
-                <w:sz w:val="16"/>
-                <w:szCs w:val="16"/>
-              </w:rPr>
-              <w:t xml:space="preserve"> tutti cifrati</w:t>
+              <w:t>Sito deve essere responsive</w:t>
             </w:r>
           </w:p>
         </w:tc>
@@ -7278,76 +6970,7 @@
                 <w:sz w:val="16"/>
                 <w:szCs w:val="16"/>
               </w:rPr>
-              <w:t>ID: REQ-08</w:t>
-            </w:r>
-          </w:p>
-        </w:tc>
-      </w:tr>
-      <w:tr>
-        <w:trPr>
-          <w:trHeight w:val="388"/>
-          <w:tblCellSpacing w:w="0" w:type="dxa"/>
-        </w:trPr>
-        <w:tc>
-          <w:tcPr>
-            <w:tcW w:w="1895" w:type="dxa"/>
-            <w:tcBorders>
-              <w:top w:val="outset" w:sz="6" w:space="0" w:color="000000"/>
-              <w:bottom w:val="outset" w:sz="6" w:space="0" w:color="000000"/>
-              <w:right w:val="outset" w:sz="6" w:space="0" w:color="000000"/>
-            </w:tcBorders>
-          </w:tcPr>
-          <w:p>
-            <w:pPr>
-              <w:spacing w:before="100" w:beforeAutospacing="1"/>
-              <w:rPr>
-                <w:b/>
-                <w:sz w:val="16"/>
-                <w:szCs w:val="16"/>
-              </w:rPr>
-            </w:pPr>
-            <w:r>
-              <w:rPr>
-                <w:b/>
-                <w:sz w:val="16"/>
-                <w:szCs w:val="16"/>
-              </w:rPr>
-              <w:t>Nome</w:t>
-            </w:r>
-          </w:p>
-        </w:tc>
-        <w:tc>
-          <w:tcPr>
-            <w:tcW w:w="7685" w:type="dxa"/>
-            <w:tcBorders>
-              <w:top w:val="outset" w:sz="6" w:space="0" w:color="000000"/>
-              <w:left w:val="outset" w:sz="6" w:space="0" w:color="000000"/>
-              <w:bottom w:val="outset" w:sz="6" w:space="0" w:color="000000"/>
-            </w:tcBorders>
-          </w:tcPr>
-          <w:p>
-            <w:pPr>
-              <w:spacing w:before="100" w:beforeAutospacing="1"/>
-              <w:rPr>
-                <w:sz w:val="16"/>
-                <w:szCs w:val="16"/>
-              </w:rPr>
-            </w:pPr>
-            <w:proofErr w:type="spellStart"/>
-            <w:r>
-              <w:rPr>
-                <w:sz w:val="16"/>
-                <w:szCs w:val="16"/>
-              </w:rPr>
-              <w:t>Deploy</w:t>
-            </w:r>
-            <w:proofErr w:type="spellEnd"/>
-            <w:r>
-              <w:rPr>
-                <w:sz w:val="16"/>
-                <w:szCs w:val="16"/>
-              </w:rPr>
-              <w:t>/hosting</w:t>
+              <w:t>ID: REQ-07</w:t>
             </w:r>
           </w:p>
         </w:tc>
@@ -7380,7 +7003,7 @@
                 <w:sz w:val="16"/>
                 <w:szCs w:val="16"/>
               </w:rPr>
-              <w:t>Priorità</w:t>
+              <w:t>Nome</w:t>
             </w:r>
           </w:p>
         </w:tc>
@@ -7406,7 +7029,23 @@
                 <w:sz w:val="16"/>
                 <w:szCs w:val="16"/>
               </w:rPr>
-              <w:t>1</w:t>
+              <w:t xml:space="preserve">Dati nel </w:t>
+            </w:r>
+            <w:proofErr w:type="spellStart"/>
+            <w:r>
+              <w:rPr>
+                <w:sz w:val="16"/>
+                <w:szCs w:val="16"/>
+              </w:rPr>
+              <w:t>db</w:t>
+            </w:r>
+            <w:proofErr w:type="spellEnd"/>
+            <w:r>
+              <w:rPr>
+                <w:sz w:val="16"/>
+                <w:szCs w:val="16"/>
+              </w:rPr>
+              <w:t xml:space="preserve"> tutti cifrati</w:t>
             </w:r>
           </w:p>
         </w:tc>
@@ -7439,7 +7078,7 @@
                 <w:sz w:val="16"/>
                 <w:szCs w:val="16"/>
               </w:rPr>
-              <w:t>Versione</w:t>
+              <w:t>Priorità</w:t>
             </w:r>
           </w:p>
         </w:tc>
@@ -7465,7 +7104,7 @@
                 <w:sz w:val="16"/>
                 <w:szCs w:val="16"/>
               </w:rPr>
-              <w:t>1.0</w:t>
+              <w:t>1</w:t>
             </w:r>
           </w:p>
         </w:tc>
@@ -7498,7 +7137,7 @@
                 <w:sz w:val="16"/>
                 <w:szCs w:val="16"/>
               </w:rPr>
-              <w:t>Note</w:t>
+              <w:t>Versione</w:t>
             </w:r>
           </w:p>
         </w:tc>
@@ -7524,8 +7163,60 @@
                 <w:sz w:val="16"/>
                 <w:szCs w:val="16"/>
               </w:rPr>
-              <w:t>Hosting che supporta Java 3.3.6</w:t>
-            </w:r>
+              <w:t>1.0</w:t>
+            </w:r>
+          </w:p>
+        </w:tc>
+      </w:tr>
+      <w:tr>
+        <w:trPr>
+          <w:tblCellSpacing w:w="0" w:type="dxa"/>
+        </w:trPr>
+        <w:tc>
+          <w:tcPr>
+            <w:tcW w:w="1895" w:type="dxa"/>
+            <w:tcBorders>
+              <w:top w:val="outset" w:sz="6" w:space="0" w:color="000000"/>
+              <w:bottom w:val="outset" w:sz="6" w:space="0" w:color="000000"/>
+              <w:right w:val="outset" w:sz="6" w:space="0" w:color="000000"/>
+            </w:tcBorders>
+          </w:tcPr>
+          <w:p>
+            <w:pPr>
+              <w:spacing w:before="100" w:beforeAutospacing="1"/>
+              <w:rPr>
+                <w:b/>
+                <w:sz w:val="16"/>
+                <w:szCs w:val="16"/>
+              </w:rPr>
+            </w:pPr>
+            <w:r>
+              <w:rPr>
+                <w:b/>
+                <w:sz w:val="16"/>
+                <w:szCs w:val="16"/>
+              </w:rPr>
+              <w:t>Note</w:t>
+            </w:r>
+          </w:p>
+        </w:tc>
+        <w:tc>
+          <w:tcPr>
+            <w:tcW w:w="7685" w:type="dxa"/>
+            <w:tcBorders>
+              <w:top w:val="outset" w:sz="6" w:space="0" w:color="000000"/>
+              <w:left w:val="outset" w:sz="6" w:space="0" w:color="000000"/>
+              <w:bottom w:val="outset" w:sz="6" w:space="0" w:color="000000"/>
+            </w:tcBorders>
+          </w:tcPr>
+          <w:p>
+            <w:pPr>
+              <w:spacing w:before="100" w:beforeAutospacing="1"/>
+              <w:rPr>
+                <w:sz w:val="16"/>
+                <w:szCs w:val="16"/>
+              </w:rPr>
+            </w:pPr>
           </w:p>
         </w:tc>
       </w:tr>
@@ -7584,7 +7275,76 @@
                 <w:sz w:val="16"/>
                 <w:szCs w:val="16"/>
               </w:rPr>
-              <w:t>ID: REQ-09</w:t>
+              <w:t>ID: REQ-08</w:t>
+            </w:r>
+          </w:p>
+        </w:tc>
+      </w:tr>
+      <w:tr>
+        <w:trPr>
+          <w:trHeight w:val="388"/>
+          <w:tblCellSpacing w:w="0" w:type="dxa"/>
+        </w:trPr>
+        <w:tc>
+          <w:tcPr>
+            <w:tcW w:w="1895" w:type="dxa"/>
+            <w:tcBorders>
+              <w:top w:val="outset" w:sz="6" w:space="0" w:color="000000"/>
+              <w:bottom w:val="outset" w:sz="6" w:space="0" w:color="000000"/>
+              <w:right w:val="outset" w:sz="6" w:space="0" w:color="000000"/>
+            </w:tcBorders>
+          </w:tcPr>
+          <w:p>
+            <w:pPr>
+              <w:spacing w:before="100" w:beforeAutospacing="1"/>
+              <w:rPr>
+                <w:b/>
+                <w:sz w:val="16"/>
+                <w:szCs w:val="16"/>
+              </w:rPr>
+            </w:pPr>
+            <w:r>
+              <w:rPr>
+                <w:b/>
+                <w:sz w:val="16"/>
+                <w:szCs w:val="16"/>
+              </w:rPr>
+              <w:t>Nome</w:t>
+            </w:r>
+          </w:p>
+        </w:tc>
+        <w:tc>
+          <w:tcPr>
+            <w:tcW w:w="7685" w:type="dxa"/>
+            <w:tcBorders>
+              <w:top w:val="outset" w:sz="6" w:space="0" w:color="000000"/>
+              <w:left w:val="outset" w:sz="6" w:space="0" w:color="000000"/>
+              <w:bottom w:val="outset" w:sz="6" w:space="0" w:color="000000"/>
+            </w:tcBorders>
+          </w:tcPr>
+          <w:p>
+            <w:pPr>
+              <w:spacing w:before="100" w:beforeAutospacing="1"/>
+              <w:rPr>
+                <w:sz w:val="16"/>
+                <w:szCs w:val="16"/>
+              </w:rPr>
+            </w:pPr>
+            <w:proofErr w:type="spellStart"/>
+            <w:r>
+              <w:rPr>
+                <w:sz w:val="16"/>
+                <w:szCs w:val="16"/>
+              </w:rPr>
+              <w:t>Deploy</w:t>
+            </w:r>
+            <w:proofErr w:type="spellEnd"/>
+            <w:r>
+              <w:rPr>
+                <w:sz w:val="16"/>
+                <w:szCs w:val="16"/>
+              </w:rPr>
+              <w:t>/hosting</w:t>
             </w:r>
           </w:p>
         </w:tc>
@@ -7617,7 +7377,7 @@
                 <w:sz w:val="16"/>
                 <w:szCs w:val="16"/>
               </w:rPr>
-              <w:t>Nome</w:t>
+              <w:t>Priorità</w:t>
             </w:r>
           </w:p>
         </w:tc>
@@ -7643,7 +7403,7 @@
                 <w:sz w:val="16"/>
                 <w:szCs w:val="16"/>
               </w:rPr>
-              <w:t>Interfaccia semplice e intuitiva</w:t>
+              <w:t>1</w:t>
             </w:r>
           </w:p>
         </w:tc>
@@ -7676,7 +7436,7 @@
                 <w:sz w:val="16"/>
                 <w:szCs w:val="16"/>
               </w:rPr>
-              <w:t>Priorità</w:t>
+              <w:t>Versione</w:t>
             </w:r>
           </w:p>
         </w:tc>
@@ -7702,7 +7462,7 @@
                 <w:sz w:val="16"/>
                 <w:szCs w:val="16"/>
               </w:rPr>
-              <w:t>1</w:t>
+              <w:t>1.0</w:t>
             </w:r>
           </w:p>
         </w:tc>
@@ -7735,7 +7495,7 @@
                 <w:sz w:val="16"/>
                 <w:szCs w:val="16"/>
               </w:rPr>
-              <w:t>Versione</w:t>
+              <w:t>Note</w:t>
             </w:r>
           </w:p>
         </w:tc>
@@ -7761,7 +7521,67 @@
                 <w:sz w:val="16"/>
                 <w:szCs w:val="16"/>
               </w:rPr>
-              <w:t>1.0</w:t>
+              <w:t>Hosting che supporta Java 3.3.6</w:t>
+            </w:r>
+          </w:p>
+        </w:tc>
+      </w:tr>
+    </w:tbl>
+    <w:p/>
+    <w:tbl>
+      <w:tblPr>
+        <w:tblW w:w="9580" w:type="dxa"/>
+        <w:tblCellSpacing w:w="0" w:type="dxa"/>
+        <w:tblInd w:w="-8" w:type="dxa"/>
+        <w:tblBorders>
+          <w:top w:val="outset" w:sz="6" w:space="0" w:color="000000"/>
+          <w:left w:val="outset" w:sz="6" w:space="0" w:color="000000"/>
+          <w:bottom w:val="outset" w:sz="6" w:space="0" w:color="000000"/>
+          <w:right w:val="outset" w:sz="6" w:space="0" w:color="000000"/>
+        </w:tblBorders>
+        <w:tblCellMar>
+          <w:top w:w="60" w:type="dxa"/>
+          <w:left w:w="60" w:type="dxa"/>
+          <w:bottom w:w="60" w:type="dxa"/>
+          <w:right w:w="60" w:type="dxa"/>
+        </w:tblCellMar>
+        <w:tblLook w:val="00A0" w:firstRow="1" w:lastRow="0" w:firstColumn="1" w:lastColumn="0" w:noHBand="0" w:noVBand="0"/>
+      </w:tblPr>
+      <w:tblGrid>
+        <w:gridCol w:w="1895"/>
+        <w:gridCol w:w="7685"/>
+      </w:tblGrid>
+      <w:tr>
+        <w:trPr>
+          <w:trHeight w:val="251"/>
+          <w:tblCellSpacing w:w="0" w:type="dxa"/>
+        </w:trPr>
+        <w:tc>
+          <w:tcPr>
+            <w:tcW w:w="9580" w:type="dxa"/>
+            <w:gridSpan w:val="2"/>
+            <w:tcBorders>
+              <w:top w:val="outset" w:sz="6" w:space="0" w:color="000000"/>
+              <w:bottom w:val="outset" w:sz="6" w:space="0" w:color="000000"/>
+            </w:tcBorders>
+          </w:tcPr>
+          <w:p>
+            <w:pPr>
+              <w:spacing w:before="100" w:beforeAutospacing="1"/>
+              <w:jc w:val="center"/>
+              <w:rPr>
+                <w:b/>
+                <w:sz w:val="16"/>
+                <w:szCs w:val="16"/>
+              </w:rPr>
+            </w:pPr>
+            <w:r>
+              <w:rPr>
+                <w:b/>
+                <w:sz w:val="16"/>
+                <w:szCs w:val="16"/>
+              </w:rPr>
+              <w:t>ID: REQ-09</w:t>
             </w:r>
           </w:p>
         </w:tc>
@@ -7794,6 +7614,183 @@
                 <w:sz w:val="16"/>
                 <w:szCs w:val="16"/>
               </w:rPr>
+              <w:t>Nome</w:t>
+            </w:r>
+          </w:p>
+        </w:tc>
+        <w:tc>
+          <w:tcPr>
+            <w:tcW w:w="7685" w:type="dxa"/>
+            <w:tcBorders>
+              <w:top w:val="outset" w:sz="6" w:space="0" w:color="000000"/>
+              <w:left w:val="outset" w:sz="6" w:space="0" w:color="000000"/>
+              <w:bottom w:val="outset" w:sz="6" w:space="0" w:color="000000"/>
+            </w:tcBorders>
+          </w:tcPr>
+          <w:p>
+            <w:pPr>
+              <w:spacing w:before="100" w:beforeAutospacing="1"/>
+              <w:rPr>
+                <w:sz w:val="16"/>
+                <w:szCs w:val="16"/>
+              </w:rPr>
+            </w:pPr>
+            <w:r>
+              <w:rPr>
+                <w:sz w:val="16"/>
+                <w:szCs w:val="16"/>
+              </w:rPr>
+              <w:t>Interfaccia semplice e intuitiva</w:t>
+            </w:r>
+          </w:p>
+        </w:tc>
+      </w:tr>
+      <w:tr>
+        <w:trPr>
+          <w:tblCellSpacing w:w="0" w:type="dxa"/>
+        </w:trPr>
+        <w:tc>
+          <w:tcPr>
+            <w:tcW w:w="1895" w:type="dxa"/>
+            <w:tcBorders>
+              <w:top w:val="outset" w:sz="6" w:space="0" w:color="000000"/>
+              <w:bottom w:val="outset" w:sz="6" w:space="0" w:color="000000"/>
+              <w:right w:val="outset" w:sz="6" w:space="0" w:color="000000"/>
+            </w:tcBorders>
+          </w:tcPr>
+          <w:p>
+            <w:pPr>
+              <w:spacing w:before="100" w:beforeAutospacing="1"/>
+              <w:rPr>
+                <w:b/>
+                <w:sz w:val="16"/>
+                <w:szCs w:val="16"/>
+              </w:rPr>
+            </w:pPr>
+            <w:r>
+              <w:rPr>
+                <w:b/>
+                <w:sz w:val="16"/>
+                <w:szCs w:val="16"/>
+              </w:rPr>
+              <w:t>Priorità</w:t>
+            </w:r>
+          </w:p>
+        </w:tc>
+        <w:tc>
+          <w:tcPr>
+            <w:tcW w:w="7685" w:type="dxa"/>
+            <w:tcBorders>
+              <w:top w:val="outset" w:sz="6" w:space="0" w:color="000000"/>
+              <w:left w:val="outset" w:sz="6" w:space="0" w:color="000000"/>
+              <w:bottom w:val="outset" w:sz="6" w:space="0" w:color="000000"/>
+            </w:tcBorders>
+          </w:tcPr>
+          <w:p>
+            <w:pPr>
+              <w:spacing w:before="100" w:beforeAutospacing="1"/>
+              <w:rPr>
+                <w:sz w:val="16"/>
+                <w:szCs w:val="16"/>
+              </w:rPr>
+            </w:pPr>
+            <w:r>
+              <w:rPr>
+                <w:sz w:val="16"/>
+                <w:szCs w:val="16"/>
+              </w:rPr>
+              <w:t>1</w:t>
+            </w:r>
+          </w:p>
+        </w:tc>
+      </w:tr>
+      <w:tr>
+        <w:trPr>
+          <w:tblCellSpacing w:w="0" w:type="dxa"/>
+        </w:trPr>
+        <w:tc>
+          <w:tcPr>
+            <w:tcW w:w="1895" w:type="dxa"/>
+            <w:tcBorders>
+              <w:top w:val="outset" w:sz="6" w:space="0" w:color="000000"/>
+              <w:bottom w:val="outset" w:sz="6" w:space="0" w:color="000000"/>
+              <w:right w:val="outset" w:sz="6" w:space="0" w:color="000000"/>
+            </w:tcBorders>
+          </w:tcPr>
+          <w:p>
+            <w:pPr>
+              <w:spacing w:before="100" w:beforeAutospacing="1"/>
+              <w:rPr>
+                <w:b/>
+                <w:sz w:val="16"/>
+                <w:szCs w:val="16"/>
+              </w:rPr>
+            </w:pPr>
+            <w:r>
+              <w:rPr>
+                <w:b/>
+                <w:sz w:val="16"/>
+                <w:szCs w:val="16"/>
+              </w:rPr>
+              <w:t>Versione</w:t>
+            </w:r>
+          </w:p>
+        </w:tc>
+        <w:tc>
+          <w:tcPr>
+            <w:tcW w:w="7685" w:type="dxa"/>
+            <w:tcBorders>
+              <w:top w:val="outset" w:sz="6" w:space="0" w:color="000000"/>
+              <w:left w:val="outset" w:sz="6" w:space="0" w:color="000000"/>
+              <w:bottom w:val="outset" w:sz="6" w:space="0" w:color="000000"/>
+            </w:tcBorders>
+          </w:tcPr>
+          <w:p>
+            <w:pPr>
+              <w:spacing w:before="100" w:beforeAutospacing="1"/>
+              <w:rPr>
+                <w:sz w:val="16"/>
+                <w:szCs w:val="16"/>
+              </w:rPr>
+            </w:pPr>
+            <w:r>
+              <w:rPr>
+                <w:sz w:val="16"/>
+                <w:szCs w:val="16"/>
+              </w:rPr>
+              <w:t>1.0</w:t>
+            </w:r>
+          </w:p>
+        </w:tc>
+      </w:tr>
+      <w:tr>
+        <w:trPr>
+          <w:tblCellSpacing w:w="0" w:type="dxa"/>
+        </w:trPr>
+        <w:tc>
+          <w:tcPr>
+            <w:tcW w:w="1895" w:type="dxa"/>
+            <w:tcBorders>
+              <w:top w:val="outset" w:sz="6" w:space="0" w:color="000000"/>
+              <w:bottom w:val="outset" w:sz="6" w:space="0" w:color="000000"/>
+              <w:right w:val="outset" w:sz="6" w:space="0" w:color="000000"/>
+            </w:tcBorders>
+          </w:tcPr>
+          <w:p>
+            <w:pPr>
+              <w:spacing w:before="100" w:beforeAutospacing="1"/>
+              <w:rPr>
+                <w:b/>
+                <w:sz w:val="16"/>
+                <w:szCs w:val="16"/>
+              </w:rPr>
+            </w:pPr>
+            <w:r>
+              <w:rPr>
+                <w:b/>
+                <w:sz w:val="16"/>
+                <w:szCs w:val="16"/>
+              </w:rPr>
               <w:t>Note</w:t>
             </w:r>
           </w:p>
@@ -7928,7 +7925,7 @@
           <w:lang w:val="it-CH"/>
         </w:rPr>
       </w:pPr>
-      <w:bookmarkStart w:id="9" w:name="_Toc193894923"/>
+      <w:bookmarkStart w:id="9" w:name="_Toc194492661"/>
       <w:r>
         <w:rPr>
           <w:lang w:val="it-CH"/>
@@ -8028,7 +8025,7 @@
           <w:lang w:val="it-CH"/>
         </w:rPr>
       </w:pPr>
-      <w:bookmarkStart w:id="10" w:name="_Toc193894924"/>
+      <w:bookmarkStart w:id="10" w:name="_Toc194492662"/>
       <w:r>
         <w:rPr>
           <w:lang w:val="it-CH"/>
@@ -8161,21 +8158,11 @@
       <w:r>
         <w:t xml:space="preserve">Figura </w:t>
       </w:r>
-      <w:r>
-        <w:fldChar w:fldCharType="begin"/>
-      </w:r>
-      <w:r>
-        <w:instrText xml:space="preserve"> SEQ Figura \* ARABIC </w:instrText>
-      </w:r>
-      <w:r>
-        <w:fldChar w:fldCharType="separate"/>
-      </w:r>
-      <w:r>
-        <w:t>1</w:t>
-      </w:r>
-      <w:r>
-        <w:fldChar w:fldCharType="end"/>
-      </w:r>
+      <w:fldSimple w:instr=" SEQ Figura \* ARABIC ">
+        <w:r>
+          <w:t>1</w:t>
+        </w:r>
+      </w:fldSimple>
       <w:r>
         <w:t xml:space="preserve"> - Use Case</w:t>
       </w:r>
@@ -8196,7 +8183,7 @@
           <w:lang w:val="it-CH"/>
         </w:rPr>
       </w:pPr>
-      <w:bookmarkStart w:id="11" w:name="_Toc193894925"/>
+      <w:bookmarkStart w:id="11" w:name="_Toc194492663"/>
       <w:r>
         <w:rPr>
           <w:lang w:val="it-CH"/>
@@ -8316,21 +8303,11 @@
       <w:r>
         <w:t xml:space="preserve">Figura </w:t>
       </w:r>
-      <w:r>
-        <w:fldChar w:fldCharType="begin"/>
-      </w:r>
-      <w:r>
-        <w:instrText xml:space="preserve"> SEQ Figura \* ARABIC </w:instrText>
-      </w:r>
-      <w:r>
-        <w:fldChar w:fldCharType="separate"/>
-      </w:r>
-      <w:r>
-        <w:t>2</w:t>
-      </w:r>
-      <w:r>
-        <w:fldChar w:fldCharType="end"/>
-      </w:r>
+      <w:fldSimple w:instr=" SEQ Figura \* ARABIC ">
+        <w:r>
+          <w:t>2</w:t>
+        </w:r>
+      </w:fldSimple>
       <w:r>
         <w:t xml:space="preserve"> - </w:t>
       </w:r>
@@ -8351,9 +8328,7 @@
           <w:footerReference w:type="first" r:id="rId17"/>
           <w:pgSz w:w="16838" w:h="11906" w:orient="landscape"/>
           <w:pgMar w:top="1134" w:right="1985" w:bottom="1134" w:left="1418" w:header="567" w:footer="567" w:gutter="0"/>
-          <w:pgNumType w:start="1"/>
           <w:cols w:space="720"/>
-          <w:titlePg/>
           <w:docGrid w:linePitch="272"/>
         </w:sectPr>
       </w:pPr>
@@ -8371,7 +8346,7 @@
           <w:lang w:val="it-CH"/>
         </w:rPr>
       </w:pPr>
-      <w:bookmarkStart w:id="12" w:name="_Toc193894926"/>
+      <w:bookmarkStart w:id="12" w:name="_Toc194492664"/>
       <w:r>
         <w:rPr>
           <w:lang w:val="it-CH"/>
@@ -8388,7 +8363,7 @@
         </w:rPr>
       </w:pPr>
       <w:bookmarkStart w:id="13" w:name="_Toc413411419"/>
-      <w:bookmarkStart w:id="14" w:name="_Toc193894927"/>
+      <w:bookmarkStart w:id="14" w:name="_Toc194492665"/>
       <w:r>
         <w:rPr>
           <w:lang w:val="it-CH"/>
@@ -8475,7 +8450,7 @@
         </w:rPr>
       </w:pPr>
       <w:bookmarkStart w:id="15" w:name="_Toc413411420"/>
-      <w:bookmarkStart w:id="16" w:name="_Toc193894928"/>
+      <w:bookmarkStart w:id="16" w:name="_Toc194492666"/>
       <w:r>
         <w:rPr>
           <w:lang w:val="it-CH"/>
@@ -8578,7 +8553,7 @@
         <w:pStyle w:val="Titolo1"/>
       </w:pPr>
       <w:bookmarkStart w:id="17" w:name="_Toc429059808"/>
-      <w:bookmarkStart w:id="18" w:name="_Toc193894929"/>
+      <w:bookmarkStart w:id="18" w:name="_Toc194492667"/>
       <w:r>
         <w:lastRenderedPageBreak/>
         <w:t>Progettazione</w:t>
@@ -8594,7 +8569,7 @@
         </w:rPr>
       </w:pPr>
       <w:bookmarkStart w:id="19" w:name="_Toc429059809"/>
-      <w:bookmarkStart w:id="20" w:name="_Toc193894930"/>
+      <w:bookmarkStart w:id="20" w:name="_Toc194492668"/>
       <w:r>
         <w:rPr>
           <w:lang w:val="it-CH"/>
@@ -8657,21 +8632,11 @@
       <w:r>
         <w:t xml:space="preserve">Figura </w:t>
       </w:r>
-      <w:r>
-        <w:fldChar w:fldCharType="begin"/>
-      </w:r>
-      <w:r>
-        <w:instrText xml:space="preserve"> SEQ Figura \* ARABIC </w:instrText>
-      </w:r>
-      <w:r>
-        <w:fldChar w:fldCharType="separate"/>
-      </w:r>
-      <w:r>
-        <w:t>3</w:t>
-      </w:r>
-      <w:r>
-        <w:fldChar w:fldCharType="end"/>
-      </w:r>
+      <w:fldSimple w:instr=" SEQ Figura \* ARABIC ">
+        <w:r>
+          <w:t>3</w:t>
+        </w:r>
+      </w:fldSimple>
       <w:r>
         <w:t xml:space="preserve"> - Diagramma Architettura</w:t>
       </w:r>
@@ -8723,7 +8688,7 @@
           <w:lang w:val="it-CH"/>
         </w:rPr>
       </w:pPr>
-      <w:bookmarkStart w:id="21" w:name="_Toc193894931"/>
+      <w:bookmarkStart w:id="21" w:name="_Toc194492669"/>
       <w:proofErr w:type="spellStart"/>
       <w:r>
         <w:rPr>
@@ -8788,21 +8753,11 @@
       <w:r>
         <w:t xml:space="preserve">Figura </w:t>
       </w:r>
-      <w:r>
-        <w:fldChar w:fldCharType="begin"/>
-      </w:r>
-      <w:r>
-        <w:instrText xml:space="preserve"> SEQ Figura \* ARABIC </w:instrText>
-      </w:r>
-      <w:r>
-        <w:fldChar w:fldCharType="separate"/>
-      </w:r>
-      <w:r>
-        <w:t>4</w:t>
-      </w:r>
-      <w:r>
-        <w:fldChar w:fldCharType="end"/>
-      </w:r>
+      <w:fldSimple w:instr=" SEQ Figura \* ARABIC ">
+        <w:r>
+          <w:t>4</w:t>
+        </w:r>
+      </w:fldSimple>
       <w:r>
         <w:t xml:space="preserve"> - </w:t>
       </w:r>
@@ -8914,24 +8869,11 @@
       <w:r>
         <w:t xml:space="preserve">Figura </w:t>
       </w:r>
-      <w:r>
-        <w:fldChar w:fldCharType="begin"/>
-      </w:r>
-      <w:r>
-        <w:instrText xml:space="preserve"> SEQ Figura \</w:instrText>
-      </w:r>
-      <w:r>
-        <w:instrText xml:space="preserve">* ARABIC </w:instrText>
-      </w:r>
-      <w:r>
-        <w:fldChar w:fldCharType="separate"/>
-      </w:r>
-      <w:r>
-        <w:t>5</w:t>
-      </w:r>
-      <w:r>
-        <w:fldChar w:fldCharType="end"/>
-      </w:r>
+      <w:fldSimple w:instr=" SEQ Figura \* ARABIC ">
+        <w:r>
+          <w:t>5</w:t>
+        </w:r>
+      </w:fldSimple>
       <w:r>
         <w:t xml:space="preserve"> - </w:t>
       </w:r>
@@ -9039,21 +8981,11 @@
       <w:r>
         <w:t xml:space="preserve">Figura </w:t>
       </w:r>
-      <w:r>
-        <w:fldChar w:fldCharType="begin"/>
-      </w:r>
-      <w:r>
-        <w:instrText xml:space="preserve"> SEQ Figura \* ARABIC </w:instrText>
-      </w:r>
-      <w:r>
-        <w:fldChar w:fldCharType="separate"/>
-      </w:r>
-      <w:r>
-        <w:t>6</w:t>
-      </w:r>
-      <w:r>
-        <w:fldChar w:fldCharType="end"/>
-      </w:r>
+      <w:fldSimple w:instr=" SEQ Figura \* ARABIC ">
+        <w:r>
+          <w:t>6</w:t>
+        </w:r>
+      </w:fldSimple>
       <w:r>
         <w:t xml:space="preserve"> - </w:t>
       </w:r>
@@ -9113,7 +9045,7 @@
         </w:rPr>
       </w:pPr>
       <w:bookmarkStart w:id="22" w:name="_Toc429059810"/>
-      <w:bookmarkStart w:id="23" w:name="_Toc193894932"/>
+      <w:bookmarkStart w:id="23" w:name="_Toc194492670"/>
       <w:r>
         <w:rPr>
           <w:lang w:val="it-CH"/>
@@ -9178,21 +9110,11 @@
       <w:r>
         <w:t xml:space="preserve">Figura </w:t>
       </w:r>
-      <w:r>
-        <w:fldChar w:fldCharType="begin"/>
-      </w:r>
-      <w:r>
-        <w:instrText xml:space="preserve"> SEQ Figura \* ARABIC </w:instrText>
-      </w:r>
-      <w:r>
-        <w:fldChar w:fldCharType="separate"/>
-      </w:r>
-      <w:r>
-        <w:t>7</w:t>
-      </w:r>
-      <w:r>
-        <w:fldChar w:fldCharType="end"/>
-      </w:r>
+      <w:fldSimple w:instr=" SEQ Figura \* ARABIC ">
+        <w:r>
+          <w:t>7</w:t>
+        </w:r>
+      </w:fldSimple>
       <w:r>
         <w:t xml:space="preserve"> - Diagramma Classi</w:t>
       </w:r>
@@ -9275,7 +9197,7 @@
         </w:rPr>
       </w:pPr>
       <w:bookmarkStart w:id="24" w:name="_Toc429059811"/>
-      <w:bookmarkStart w:id="25" w:name="_Toc193894933"/>
+      <w:bookmarkStart w:id="25" w:name="_Toc194492671"/>
       <w:r>
         <w:rPr>
           <w:lang w:val="it-CH"/>
@@ -9300,7 +9222,7 @@
           <w:lang w:val="it-CH"/>
         </w:rPr>
       </w:pPr>
-      <w:bookmarkStart w:id="26" w:name="_Toc193894934"/>
+      <w:bookmarkStart w:id="26" w:name="_Toc194492672"/>
       <w:r>
         <w:rPr>
           <w:lang w:val="it-CH"/>
@@ -9374,21 +9296,11 @@
       <w:r>
         <w:t xml:space="preserve">Figura </w:t>
       </w:r>
-      <w:r>
-        <w:fldChar w:fldCharType="begin"/>
-      </w:r>
-      <w:r>
-        <w:instrText xml:space="preserve"> SEQ Figura \* ARABIC </w:instrText>
-      </w:r>
-      <w:r>
-        <w:fldChar w:fldCharType="separate"/>
-      </w:r>
-      <w:r>
-        <w:t>8</w:t>
-      </w:r>
-      <w:r>
-        <w:fldChar w:fldCharType="end"/>
-      </w:r>
+      <w:fldSimple w:instr=" SEQ Figura \* ARABIC ">
+        <w:r>
+          <w:t>8</w:t>
+        </w:r>
+      </w:fldSimple>
       <w:r>
         <w:t xml:space="preserve"> - Design registrazione utente</w:t>
       </w:r>
@@ -9450,7 +9362,7 @@
           <w:lang w:val="it-CH"/>
         </w:rPr>
       </w:pPr>
-      <w:bookmarkStart w:id="27" w:name="_Toc193894935"/>
+      <w:bookmarkStart w:id="27" w:name="_Toc194492673"/>
       <w:r>
         <w:rPr>
           <w:lang w:val="it-CH"/>
@@ -9526,21 +9438,11 @@
       <w:r>
         <w:t xml:space="preserve">Figura </w:t>
       </w:r>
-      <w:r>
-        <w:fldChar w:fldCharType="begin"/>
-      </w:r>
-      <w:r>
-        <w:instrText xml:space="preserve"> SEQ Figura \* ARABIC </w:instrText>
-      </w:r>
-      <w:r>
-        <w:fldChar w:fldCharType="separate"/>
-      </w:r>
-      <w:r>
-        <w:t>9</w:t>
-      </w:r>
-      <w:r>
-        <w:fldChar w:fldCharType="end"/>
-      </w:r>
+      <w:fldSimple w:instr=" SEQ Figura \* ARABIC ">
+        <w:r>
+          <w:t>9</w:t>
+        </w:r>
+      </w:fldSimple>
       <w:r>
         <w:t xml:space="preserve"> - Design login utente</w:t>
       </w:r>
@@ -9569,7 +9471,7 @@
           <w:lang w:val="it-CH"/>
         </w:rPr>
       </w:pPr>
-      <w:bookmarkStart w:id="28" w:name="_Toc193894936"/>
+      <w:bookmarkStart w:id="28" w:name="_Toc194492674"/>
       <w:r>
         <w:rPr>
           <w:lang w:val="it-CH"/>
@@ -9644,21 +9546,11 @@
       <w:r>
         <w:t xml:space="preserve">Figura </w:t>
       </w:r>
-      <w:r>
-        <w:fldChar w:fldCharType="begin"/>
-      </w:r>
-      <w:r>
-        <w:instrText xml:space="preserve"> SEQ Figura \* ARABIC </w:instrText>
-      </w:r>
-      <w:r>
-        <w:fldChar w:fldCharType="separate"/>
-      </w:r>
-      <w:r>
-        <w:t>10</w:t>
-      </w:r>
-      <w:r>
-        <w:fldChar w:fldCharType="end"/>
-      </w:r>
+      <w:fldSimple w:instr=" SEQ Figura \* ARABIC ">
+        <w:r>
+          <w:t>10</w:t>
+        </w:r>
+      </w:fldSimple>
       <w:r>
         <w:t xml:space="preserve"> - Design home</w:t>
       </w:r>
@@ -9696,7 +9588,7 @@
           <w:lang w:val="it-CH"/>
         </w:rPr>
       </w:pPr>
-      <w:bookmarkStart w:id="29" w:name="_Toc193894937"/>
+      <w:bookmarkStart w:id="29" w:name="_Toc194492675"/>
       <w:r>
         <w:rPr>
           <w:lang w:val="it-CH"/>
@@ -9771,21 +9663,11 @@
       <w:r>
         <w:t xml:space="preserve">Figura </w:t>
       </w:r>
-      <w:r>
-        <w:fldChar w:fldCharType="begin"/>
-      </w:r>
-      <w:r>
-        <w:instrText xml:space="preserve"> SEQ Figura \* ARABIC </w:instrText>
-      </w:r>
-      <w:r>
-        <w:fldChar w:fldCharType="separate"/>
-      </w:r>
-      <w:r>
-        <w:t>11</w:t>
-      </w:r>
-      <w:r>
-        <w:fldChar w:fldCharType="end"/>
-      </w:r>
+      <w:fldSimple w:instr=" SEQ Figura \* ARABIC ">
+        <w:r>
+          <w:t>11</w:t>
+        </w:r>
+      </w:fldSimple>
       <w:r>
         <w:t xml:space="preserve"> - Design creazione nota</w:t>
       </w:r>
@@ -9846,7 +9728,7 @@
           <w:lang w:val="it-CH"/>
         </w:rPr>
       </w:pPr>
-      <w:bookmarkStart w:id="30" w:name="_Toc193894938"/>
+      <w:bookmarkStart w:id="30" w:name="_Toc194492676"/>
       <w:r>
         <w:rPr>
           <w:lang w:val="it-CH"/>
@@ -9921,21 +9803,11 @@
       <w:r>
         <w:t xml:space="preserve">Figura </w:t>
       </w:r>
-      <w:r>
-        <w:fldChar w:fldCharType="begin"/>
-      </w:r>
-      <w:r>
-        <w:instrText xml:space="preserve"> SEQ Figura \* ARABIC </w:instrText>
-      </w:r>
-      <w:r>
-        <w:fldChar w:fldCharType="separate"/>
-      </w:r>
-      <w:r>
-        <w:t>12</w:t>
-      </w:r>
-      <w:r>
-        <w:fldChar w:fldCharType="end"/>
-      </w:r>
+      <w:fldSimple w:instr=" SEQ Figura \* ARABIC ">
+        <w:r>
+          <w:t>12</w:t>
+        </w:r>
+      </w:fldSimple>
       <w:r>
         <w:t xml:space="preserve"> - Design visualizzazione note</w:t>
       </w:r>
@@ -9977,7 +9849,7 @@
         </w:rPr>
       </w:pPr>
       <w:bookmarkStart w:id="31" w:name="_Toc429059812"/>
-      <w:bookmarkStart w:id="32" w:name="_Toc193894939"/>
+      <w:bookmarkStart w:id="32" w:name="_Toc194492677"/>
       <w:r>
         <w:rPr>
           <w:lang w:val="it-CH"/>
@@ -10072,7 +9944,7 @@
         </w:pBdr>
       </w:pPr>
       <w:bookmarkStart w:id="33" w:name="_Toc461179222"/>
-      <w:bookmarkStart w:id="34" w:name="_Toc193894940"/>
+      <w:bookmarkStart w:id="34" w:name="_Toc194492678"/>
       <w:r>
         <w:lastRenderedPageBreak/>
         <w:t>Implementazione</w:t>
@@ -10144,7 +10016,7 @@
         <w:pStyle w:val="Titolo1"/>
       </w:pPr>
       <w:bookmarkStart w:id="35" w:name="_Toc461179223"/>
-      <w:bookmarkStart w:id="36" w:name="_Toc193894941"/>
+      <w:bookmarkStart w:id="36" w:name="_Toc194492679"/>
       <w:r>
         <w:t>Test</w:t>
       </w:r>
@@ -10159,7 +10031,7 @@
         </w:rPr>
       </w:pPr>
       <w:bookmarkStart w:id="37" w:name="_Toc461179224"/>
-      <w:bookmarkStart w:id="38" w:name="_Toc193894942"/>
+      <w:bookmarkStart w:id="38" w:name="_Toc194492680"/>
       <w:r>
         <w:rPr>
           <w:lang w:val="it-CH"/>
@@ -17819,7 +17691,7 @@
           <w:lang w:val="it-CH"/>
         </w:rPr>
       </w:pPr>
-      <w:bookmarkStart w:id="40" w:name="_Toc193894943"/>
+      <w:bookmarkStart w:id="40" w:name="_Toc194492681"/>
       <w:r>
         <w:rPr>
           <w:lang w:val="it-CH"/>
@@ -17842,7 +17714,7 @@
         </w:rPr>
       </w:pPr>
       <w:bookmarkStart w:id="41" w:name="_Toc461179226"/>
-      <w:bookmarkStart w:id="42" w:name="_Toc193894944"/>
+      <w:bookmarkStart w:id="42" w:name="_Toc194492682"/>
       <w:r>
         <w:rPr>
           <w:lang w:val="it-CH"/>
@@ -17862,7 +17734,7 @@
         <w:pStyle w:val="Titolo1"/>
       </w:pPr>
       <w:bookmarkStart w:id="43" w:name="_Toc461179227"/>
-      <w:bookmarkStart w:id="44" w:name="_Toc193894945"/>
+      <w:bookmarkStart w:id="44" w:name="_Toc194492683"/>
       <w:r>
         <w:t>Consuntivo</w:t>
       </w:r>
@@ -17899,7 +17771,7 @@
         <w:pStyle w:val="Titolo1"/>
       </w:pPr>
       <w:bookmarkStart w:id="45" w:name="_Toc461179228"/>
-      <w:bookmarkStart w:id="46" w:name="_Toc193894946"/>
+      <w:bookmarkStart w:id="46" w:name="_Toc194492684"/>
       <w:r>
         <w:lastRenderedPageBreak/>
         <w:t>Conclusioni</w:t>
@@ -17923,7 +17795,7 @@
         </w:rPr>
       </w:pPr>
       <w:bookmarkStart w:id="47" w:name="_Toc461179229"/>
-      <w:bookmarkStart w:id="48" w:name="_Toc193894947"/>
+      <w:bookmarkStart w:id="48" w:name="_Toc194492685"/>
       <w:r>
         <w:rPr>
           <w:lang w:val="it-CH"/>
@@ -17946,7 +17818,7 @@
         </w:rPr>
       </w:pPr>
       <w:bookmarkStart w:id="49" w:name="_Toc461179230"/>
-      <w:bookmarkStart w:id="50" w:name="_Toc193894948"/>
+      <w:bookmarkStart w:id="50" w:name="_Toc194492686"/>
       <w:r>
         <w:rPr>
           <w:lang w:val="it-CH"/>
@@ -17968,12 +17840,12 @@
       <w:pPr>
         <w:pStyle w:val="Titolo1"/>
       </w:pPr>
-      <w:bookmarkStart w:id="51" w:name="_Toc461179232"/>
-      <w:bookmarkStart w:id="52" w:name="_Toc193894949"/>
+      <w:bookmarkStart w:id="51" w:name="_Toc194492687"/>
+      <w:bookmarkStart w:id="52" w:name="_Toc461179232"/>
       <w:r>
         <w:t>Glossario</w:t>
       </w:r>
-      <w:bookmarkEnd w:id="52"/>
+      <w:bookmarkEnd w:id="51"/>
     </w:p>
     <w:p>
       <w:r>
@@ -18158,7 +18030,7 @@
       <w:pPr>
         <w:pStyle w:val="Titolo1"/>
       </w:pPr>
-      <w:bookmarkStart w:id="53" w:name="_Toc193894950"/>
+      <w:bookmarkStart w:id="53" w:name="_Toc194492688"/>
       <w:r>
         <w:lastRenderedPageBreak/>
         <w:t>Bibliografia</w:t>
@@ -18172,14 +18044,14 @@
           <w:lang w:val="it-CH"/>
         </w:rPr>
       </w:pPr>
-      <w:bookmarkStart w:id="54" w:name="_Toc193894951"/>
+      <w:bookmarkStart w:id="54" w:name="_Toc194492689"/>
       <w:r>
         <w:rPr>
           <w:lang w:val="it-CH"/>
         </w:rPr>
         <w:t>Bibliografia per articoli di riviste:</w:t>
       </w:r>
-      <w:bookmarkEnd w:id="51"/>
+      <w:bookmarkEnd w:id="52"/>
       <w:bookmarkEnd w:id="54"/>
     </w:p>
     <w:p>
@@ -18248,7 +18120,7 @@
         </w:rPr>
       </w:pPr>
       <w:bookmarkStart w:id="55" w:name="_Toc461179233"/>
-      <w:bookmarkStart w:id="56" w:name="_Toc193894952"/>
+      <w:bookmarkStart w:id="56" w:name="_Toc194492690"/>
       <w:r>
         <w:rPr>
           <w:lang w:val="it-CH"/>
@@ -18344,7 +18216,7 @@
           <w:lang w:val="it-CH"/>
         </w:rPr>
       </w:pPr>
-      <w:bookmarkStart w:id="58" w:name="_Toc193894953"/>
+      <w:bookmarkStart w:id="58" w:name="_Toc194492691"/>
       <w:r>
         <w:rPr>
           <w:lang w:val="it-CH"/>
@@ -18457,7 +18329,7 @@
         <w:pStyle w:val="Titolo1"/>
       </w:pPr>
       <w:bookmarkStart w:id="59" w:name="_Toc461179235"/>
-      <w:bookmarkStart w:id="60" w:name="_Toc193894954"/>
+      <w:bookmarkStart w:id="60" w:name="_Toc194492692"/>
       <w:r>
         <w:t>Allegati</w:t>
       </w:r>
@@ -18574,7 +18446,6 @@
     <w:sectPr>
       <w:pgSz w:w="11906" w:h="16838"/>
       <w:pgMar w:top="1985" w:right="1134" w:bottom="1418" w:left="1134" w:header="567" w:footer="567" w:gutter="0"/>
-      <w:pgNumType w:start="1"/>
       <w:cols w:space="720"/>
       <w:titlePg/>
       <w:docGrid w:linePitch="272"/>
@@ -18667,7 +18538,7 @@
       <w:rPr>
         <w:noProof/>
       </w:rPr>
-      <w:t>26.03.2025</w:t>
+      <w:t>02.04.2025</w:t>
     </w:r>
     <w:r>
       <w:fldChar w:fldCharType="end"/>
@@ -19010,7 +18881,7 @@
       <w:rPr>
         <w:noProof/>
       </w:rPr>
-      <w:t>26.03.2025</w:t>
+      <w:t>02.04.2025</w:t>
     </w:r>
     <w:r>
       <w:fldChar w:fldCharType="end"/>
@@ -19084,7 +18955,7 @@
       <w:rPr>
         <w:noProof/>
       </w:rPr>
-      <w:t>26.03.2025</w:t>
+      <w:t>02.04.2025</w:t>
     </w:r>
     <w:r>
       <w:fldChar w:fldCharType="end"/>
@@ -19177,7 +19048,7 @@
               <wp:inline distT="0" distB="0" distL="0" distR="0" wp14:anchorId="3308B052" wp14:editId="6F6101F1">
                 <wp:extent cx="609600" cy="609600"/>
                 <wp:effectExtent l="0" t="0" r="0" b="0"/>
-                <wp:docPr id="16" name="Immagine 16"/>
+                <wp:docPr id="22" name="Immagine 22"/>
                 <wp:cNvGraphicFramePr>
                   <a:graphicFrameLocks xmlns:a="http://schemas.openxmlformats.org/drawingml/2006/main" noChangeAspect="1"/>
                 </wp:cNvGraphicFramePr>
@@ -19545,7 +19416,7 @@
               <wp:inline distT="0" distB="0" distL="0" distR="0" wp14:anchorId="779477AE" wp14:editId="15C0353E">
                 <wp:extent cx="609600" cy="609600"/>
                 <wp:effectExtent l="0" t="0" r="0" b="0"/>
-                <wp:docPr id="17" name="Immagine 17"/>
+                <wp:docPr id="23" name="Immagine 23"/>
                 <wp:cNvGraphicFramePr>
                   <a:graphicFrameLocks xmlns:a="http://schemas.openxmlformats.org/drawingml/2006/main" noChangeAspect="1"/>
                 </wp:cNvGraphicFramePr>
@@ -19771,7 +19642,7 @@
               <wp:inline distT="0" distB="0" distL="0" distR="0" wp14:anchorId="47679B3C" wp14:editId="6CBB2776">
                 <wp:extent cx="609600" cy="609600"/>
                 <wp:effectExtent l="0" t="0" r="0" b="0"/>
-                <wp:docPr id="24" name="Immagine 24"/>
+                <wp:docPr id="27" name="Immagine 27"/>
                 <wp:cNvGraphicFramePr>
                   <a:graphicFrameLocks xmlns:a="http://schemas.openxmlformats.org/drawingml/2006/main" noChangeAspect="1"/>
                 </wp:cNvGraphicFramePr>
@@ -20081,7 +19952,8 @@
 <w:hdr xmlns:wpc="http://schemas.microsoft.com/office/word/2010/wordprocessingCanvas" xmlns:cx="http://schemas.microsoft.com/office/drawing/2014/chartex" xmlns:cx1="http://schemas.microsoft.com/office/drawing/2015/9/8/chartex" xmlns:cx2="http://schemas.microsoft.com/office/drawing/2015/10/21/chartex" xmlns:cx3="http://schemas.microsoft.com/office/drawing/2016/5/9/chartex" xmlns:cx4="http://schemas.microsoft.com/office/drawing/2016/5/10/chartex" xmlns:cx5="http://schemas.microsoft.com/office/drawing/2016/5/11/chartex" xmlns:cx6="http://schemas.microsoft.com/office/drawing/2016/5/12/chartex" xmlns:cx7="http://schemas.microsoft.com/office/drawing/2016/5/13/chartex" xmlns:cx8="http://schemas.microsoft.com/office/drawing/2016/5/14/chartex" xmlns:mc="http://schemas.openxmlformats.org/markup-compatibility/2006" xmlns:aink="http://schemas.microsoft.com/office/drawing/2016/ink" xmlns:am3d="http://schemas.microsoft.com/office/drawing/2017/model3d" xmlns:o="urn:schemas-microsoft-com:office:office" xmlns:r="http://schemas.openxmlformats.org/officeDocument/2006/relationships" xmlns:m="http://schemas.openxmlformats.org/officeDocument/2006/math" xmlns:v="urn:schemas-microsoft-com:vml" xmlns:wp14="http://schemas.microsoft.com/office/word/2010/wordprocessingDrawing" xmlns:wp="http://schemas.openxmlformats.org/drawingml/2006/wordprocessingDrawing" xmlns:w10="urn:schemas-microsoft-com:office:word" xmlns:w="http://schemas.openxmlformats.org/wordprocessingml/2006/main" xmlns:w14="http://schemas.microsoft.com/office/word/2010/wordml" xmlns:w15="http://schemas.microsoft.com/office/word/2012/wordml" xmlns:w16cid="http://schemas.microsoft.com/office/word/2016/wordml/cid" xmlns:w16se="http://schemas.microsoft.com/office/word/2015/wordml/symex" xmlns:wpg="http://schemas.microsoft.com/office/word/2010/wordprocessingGroup" xmlns:wpi="http://schemas.microsoft.com/office/word/2010/wordprocessingInk" xmlns:wne="http://schemas.microsoft.com/office/word/2006/wordml" xmlns:wps="http://schemas.microsoft.com/office/word/2010/wordprocessingShape" mc:Ignorable="w14 w15 w16se w16cid wp14">
   <w:tbl>
     <w:tblPr>
-      <w:tblW w:w="9644" w:type="dxa"/>
+      <w:tblW w:w="9639" w:type="dxa"/>
+      <w:jc w:val="center"/>
       <w:tblBorders>
         <w:top w:val="single" w:sz="4" w:space="0" w:color="auto"/>
         <w:left w:val="single" w:sz="4" w:space="0" w:color="auto"/>
@@ -20097,11 +19969,13 @@
     </w:tblPr>
     <w:tblGrid>
       <w:gridCol w:w="964"/>
-      <w:gridCol w:w="8680"/>
+      <w:gridCol w:w="7087"/>
+      <w:gridCol w:w="1588"/>
     </w:tblGrid>
     <w:tr>
       <w:trPr>
         <w:trHeight w:hRule="exact" w:val="482"/>
+        <w:jc w:val="center"/>
       </w:trPr>
       <w:tc>
         <w:tcPr>
@@ -20136,10 +20010,10 @@
               <w:sz w:val="28"/>
             </w:rPr>
             <w:drawing>
-              <wp:inline distT="0" distB="0" distL="0" distR="0" wp14:anchorId="62E5B9D9" wp14:editId="2217ADE6">
+              <wp:inline distT="0" distB="0" distL="0" distR="0" wp14:anchorId="10FFAAAF" wp14:editId="3B43C0CF">
                 <wp:extent cx="609600" cy="609600"/>
                 <wp:effectExtent l="0" t="0" r="0" b="0"/>
-                <wp:docPr id="25" name="Immagine 25"/>
+                <wp:docPr id="39" name="Immagine 39"/>
                 <wp:cNvGraphicFramePr>
                   <a:graphicFrameLocks xmlns:a="http://schemas.openxmlformats.org/drawingml/2006/main" noChangeAspect="1"/>
                 </wp:cNvGraphicFramePr>
@@ -20147,7 +20021,7 @@
                   <a:graphicData uri="http://schemas.openxmlformats.org/drawingml/2006/picture">
                     <pic:pic xmlns:pic="http://schemas.openxmlformats.org/drawingml/2006/picture">
                       <pic:nvPicPr>
-                        <pic:cNvPr id="0" name="Picture 3"/>
+                        <pic:cNvPr id="0" name="Picture 2"/>
                         <pic:cNvPicPr>
                           <a:picLocks noChangeAspect="1" noChangeArrowheads="1"/>
                         </pic:cNvPicPr>
@@ -20188,7 +20062,7 @@
       </w:tc>
       <w:tc>
         <w:tcPr>
-          <w:tcW w:w="8680" w:type="dxa"/>
+          <w:tcW w:w="7088" w:type="dxa"/>
           <w:tcBorders>
             <w:top w:val="single" w:sz="4" w:space="0" w:color="auto"/>
             <w:left w:val="single" w:sz="4" w:space="0" w:color="auto"/>
@@ -20219,7 +20093,118 @@
               <w:sz w:val="24"/>
               <w:szCs w:val="24"/>
             </w:rPr>
-            <w:t>Scuola Arti e Mestieri Trevano</w:t>
+            <w:t>SAMT – Sezione Informatica</w:t>
+          </w:r>
+        </w:p>
+      </w:tc>
+      <w:tc>
+        <w:tcPr>
+          <w:tcW w:w="1588" w:type="dxa"/>
+          <w:vMerge w:val="restart"/>
+          <w:tcBorders>
+            <w:top w:val="single" w:sz="4" w:space="0" w:color="auto"/>
+            <w:left w:val="single" w:sz="4" w:space="0" w:color="auto"/>
+            <w:right w:val="single" w:sz="4" w:space="0" w:color="auto"/>
+          </w:tcBorders>
+          <w:tcMar>
+            <w:left w:w="0" w:type="dxa"/>
+            <w:right w:w="0" w:type="dxa"/>
+          </w:tcMar>
+          <w:vAlign w:val="center"/>
+        </w:tcPr>
+        <w:p>
+          <w:pPr>
+            <w:pStyle w:val="Intestazione"/>
+            <w:jc w:val="center"/>
+            <w:rPr>
+              <w:rFonts w:cs="Arial"/>
+            </w:rPr>
+          </w:pPr>
+          <w:r>
+            <w:rPr>
+              <w:rFonts w:cs="Arial"/>
+              <w:snapToGrid w:val="0"/>
+            </w:rPr>
+            <w:t xml:space="preserve">Pagina </w:t>
+          </w:r>
+          <w:r>
+            <w:rPr>
+              <w:rFonts w:cs="Arial"/>
+              <w:snapToGrid w:val="0"/>
+            </w:rPr>
+            <w:fldChar w:fldCharType="begin"/>
+          </w:r>
+          <w:r>
+            <w:rPr>
+              <w:rFonts w:cs="Arial"/>
+              <w:snapToGrid w:val="0"/>
+            </w:rPr>
+            <w:instrText xml:space="preserve"> PAGE </w:instrText>
+          </w:r>
+          <w:r>
+            <w:rPr>
+              <w:rFonts w:cs="Arial"/>
+              <w:snapToGrid w:val="0"/>
+            </w:rPr>
+            <w:fldChar w:fldCharType="separate"/>
+          </w:r>
+          <w:r>
+            <w:rPr>
+              <w:rFonts w:cs="Arial"/>
+              <w:noProof/>
+              <w:snapToGrid w:val="0"/>
+            </w:rPr>
+            <w:t>8</w:t>
+          </w:r>
+          <w:r>
+            <w:rPr>
+              <w:rFonts w:cs="Arial"/>
+              <w:snapToGrid w:val="0"/>
+            </w:rPr>
+            <w:fldChar w:fldCharType="end"/>
+          </w:r>
+          <w:r>
+            <w:rPr>
+              <w:rFonts w:cs="Arial"/>
+              <w:snapToGrid w:val="0"/>
+            </w:rPr>
+            <w:t xml:space="preserve"> di </w:t>
+          </w:r>
+          <w:r>
+            <w:rPr>
+              <w:rFonts w:cs="Arial"/>
+              <w:snapToGrid w:val="0"/>
+            </w:rPr>
+            <w:fldChar w:fldCharType="begin"/>
+          </w:r>
+          <w:r>
+            <w:rPr>
+              <w:rFonts w:cs="Arial"/>
+              <w:snapToGrid w:val="0"/>
+            </w:rPr>
+            <w:instrText xml:space="preserve"> NUMPAGES </w:instrText>
+          </w:r>
+          <w:r>
+            <w:rPr>
+              <w:rFonts w:cs="Arial"/>
+              <w:snapToGrid w:val="0"/>
+            </w:rPr>
+            <w:fldChar w:fldCharType="separate"/>
+          </w:r>
+          <w:r>
+            <w:rPr>
+              <w:rFonts w:cs="Arial"/>
+              <w:noProof/>
+              <w:snapToGrid w:val="0"/>
+            </w:rPr>
+            <w:t>10</w:t>
+          </w:r>
+          <w:r>
+            <w:rPr>
+              <w:rFonts w:cs="Arial"/>
+              <w:snapToGrid w:val="0"/>
+            </w:rPr>
+            <w:fldChar w:fldCharType="end"/>
           </w:r>
         </w:p>
       </w:tc>
@@ -20227,6 +20212,7 @@
     <w:tr>
       <w:trPr>
         <w:trHeight w:hRule="exact" w:val="482"/>
+        <w:jc w:val="center"/>
       </w:trPr>
       <w:tc>
         <w:tcPr>
@@ -20255,7 +20241,7 @@
       </w:tc>
       <w:tc>
         <w:tcPr>
-          <w:tcW w:w="8680" w:type="dxa"/>
+          <w:tcW w:w="7088" w:type="dxa"/>
           <w:tcBorders>
             <w:top w:val="single" w:sz="4" w:space="0" w:color="auto"/>
             <w:left w:val="single" w:sz="4" w:space="0" w:color="auto"/>
@@ -20279,6 +20265,7 @@
               <w:szCs w:val="24"/>
             </w:rPr>
           </w:pPr>
+          <w:proofErr w:type="spellStart"/>
           <w:r>
             <w:rPr>
               <w:rFonts w:cs="Arial"/>
@@ -20286,8 +20273,35 @@
               <w:sz w:val="24"/>
               <w:szCs w:val="24"/>
             </w:rPr>
-            <w:t>Sezione informatica</w:t>
+            <w:t>CasaNote</w:t>
           </w:r>
+          <w:proofErr w:type="spellEnd"/>
+        </w:p>
+      </w:tc>
+      <w:tc>
+        <w:tcPr>
+          <w:tcW w:w="1588" w:type="dxa"/>
+          <w:vMerge/>
+          <w:tcBorders>
+            <w:left w:val="single" w:sz="4" w:space="0" w:color="auto"/>
+            <w:bottom w:val="single" w:sz="4" w:space="0" w:color="auto"/>
+            <w:right w:val="single" w:sz="4" w:space="0" w:color="auto"/>
+          </w:tcBorders>
+          <w:tcMar>
+            <w:left w:w="0" w:type="dxa"/>
+            <w:right w:w="0" w:type="dxa"/>
+          </w:tcMar>
+          <w:vAlign w:val="center"/>
+        </w:tcPr>
+        <w:p>
+          <w:pPr>
+            <w:pStyle w:val="Intestazione"/>
+            <w:jc w:val="center"/>
+            <w:rPr>
+              <w:rFonts w:cs="Arial"/>
+              <w:lang w:val="it-IT"/>
+            </w:rPr>
+          </w:pPr>
         </w:p>
       </w:tc>
     </w:tr>
@@ -24397,7 +24411,7 @@
     <w:lsdException w:name="Normal Indent" w:semiHidden="1" w:unhideWhenUsed="1"/>
     <w:lsdException w:name="footnote text" w:semiHidden="1" w:unhideWhenUsed="1"/>
     <w:lsdException w:name="annotation text" w:semiHidden="1" w:unhideWhenUsed="1"/>
-    <w:lsdException w:name="header" w:semiHidden="1" w:unhideWhenUsed="1"/>
+    <w:lsdException w:name="header" w:semiHidden="1" w:uiPriority="0" w:unhideWhenUsed="1"/>
     <w:lsdException w:name="footer" w:semiHidden="1" w:unhideWhenUsed="1"/>
     <w:lsdException w:name="index heading" w:semiHidden="1" w:unhideWhenUsed="1"/>
     <w:lsdException w:name="caption" w:uiPriority="35" w:qFormat="1"/>
@@ -24973,6 +24987,7 @@
   <w:style w:type="paragraph" w:styleId="Intestazione">
     <w:name w:val="header"/>
     <w:basedOn w:val="Normale"/>
+    <w:link w:val="IntestazioneCarattere"/>
     <w:pPr>
       <w:tabs>
         <w:tab w:val="center" w:pos="4819"/>
@@ -25318,6 +25333,16 @@
       <w:contextualSpacing/>
     </w:pPr>
   </w:style>
+  <w:style w:type="character" w:customStyle="1" w:styleId="IntestazioneCarattere">
+    <w:name w:val="Intestazione Carattere"/>
+    <w:basedOn w:val="Carpredefinitoparagrafo"/>
+    <w:link w:val="Intestazione"/>
+    <w:rsid w:val="00B94DB1"/>
+    <w:rPr>
+      <w:rFonts w:ascii="Arial" w:hAnsi="Arial"/>
+      <w:lang w:eastAsia="it-IT"/>
+    </w:rPr>
+  </w:style>
 </w:styles>
 </file>
 
@@ -25621,7 +25646,7 @@
 </file>
 
 <file path=customXml/itemProps1.xml><?xml version="1.0" encoding="utf-8"?>
-<ds:datastoreItem xmlns:ds="http://schemas.openxmlformats.org/officeDocument/2006/customXml" ds:itemID="{5DD77035-9C2E-4A3B-8D9D-8B3425C5FB4B}">
+<ds:datastoreItem xmlns:ds="http://schemas.openxmlformats.org/officeDocument/2006/customXml" ds:itemID="{C2F287C5-5957-4233-A266-7329F9925B68}">
   <ds:schemaRefs>
     <ds:schemaRef ds:uri="http://schemas.openxmlformats.org/officeDocument/2006/bibliography"/>
   </ds:schemaRefs>

</xml_diff>

<commit_message>
aggiornatoo sicurezza dei link
</commit_message>
<xml_diff>
--- a/3_Documentazione/Documentazione_CasaNote.docx
+++ b/3_Documentazione/Documentazione_CasaNote.docx
@@ -5517,6 +5517,15 @@
                 <w:szCs w:val="16"/>
               </w:rPr>
             </w:pPr>
+            <w:r>
+              <w:rPr>
+                <w:sz w:val="16"/>
+                <w:szCs w:val="16"/>
+              </w:rPr>
+              <w:t xml:space="preserve">Come extra </w:t>
+            </w:r>
+            <w:bookmarkStart w:id="8" w:name="_GoBack"/>
+            <w:bookmarkEnd w:id="8"/>
             <w:proofErr w:type="spellStart"/>
             <w:r>
               <w:rPr>
@@ -7923,7 +7932,7 @@
           <w:lang w:val="it-CH"/>
         </w:rPr>
       </w:pPr>
-      <w:bookmarkStart w:id="8" w:name="_Toc194492661"/>
+      <w:bookmarkStart w:id="9" w:name="_Toc194492661"/>
       <w:r>
         <w:rPr>
           <w:lang w:val="it-CH"/>
@@ -7931,7 +7940,7 @@
         <w:lastRenderedPageBreak/>
         <w:t>Spiegazione elementi tabella dei requisiti:</w:t>
       </w:r>
-      <w:bookmarkEnd w:id="8"/>
+      <w:bookmarkEnd w:id="9"/>
     </w:p>
     <w:p>
       <w:r>
@@ -8023,7 +8032,7 @@
           <w:lang w:val="it-CH"/>
         </w:rPr>
       </w:pPr>
-      <w:bookmarkStart w:id="9" w:name="_Toc194492662"/>
+      <w:bookmarkStart w:id="10" w:name="_Toc194492662"/>
       <w:r>
         <w:rPr>
           <w:lang w:val="it-CH"/>
@@ -8031,7 +8040,7 @@
         <w:lastRenderedPageBreak/>
         <w:t>Use case</w:t>
       </w:r>
-      <w:bookmarkEnd w:id="9"/>
+      <w:bookmarkEnd w:id="10"/>
     </w:p>
     <w:p>
       <w:pPr>
@@ -8156,21 +8165,11 @@
       <w:r>
         <w:t xml:space="preserve">Figura </w:t>
       </w:r>
-      <w:r>
-        <w:fldChar w:fldCharType="begin"/>
-      </w:r>
-      <w:r>
-        <w:instrText xml:space="preserve"> SEQ Figura \* ARABIC </w:instrText>
-      </w:r>
-      <w:r>
-        <w:fldChar w:fldCharType="separate"/>
-      </w:r>
-      <w:r>
-        <w:t>1</w:t>
-      </w:r>
-      <w:r>
-        <w:fldChar w:fldCharType="end"/>
-      </w:r>
+      <w:fldSimple w:instr=" SEQ Figura \* ARABIC ">
+        <w:r>
+          <w:t>1</w:t>
+        </w:r>
+      </w:fldSimple>
       <w:r>
         <w:t xml:space="preserve"> - Use Case</w:t>
       </w:r>
@@ -8191,7 +8190,7 @@
           <w:lang w:val="it-CH"/>
         </w:rPr>
       </w:pPr>
-      <w:bookmarkStart w:id="10" w:name="_Toc194492663"/>
+      <w:bookmarkStart w:id="11" w:name="_Toc194492663"/>
       <w:r>
         <w:rPr>
           <w:lang w:val="it-CH"/>
@@ -8199,7 +8198,7 @@
         <w:lastRenderedPageBreak/>
         <w:t>Pianificazione</w:t>
       </w:r>
-      <w:bookmarkEnd w:id="10"/>
+      <w:bookmarkEnd w:id="11"/>
     </w:p>
     <w:p>
       <w:pPr>
@@ -8311,21 +8310,11 @@
       <w:r>
         <w:t xml:space="preserve">Figura </w:t>
       </w:r>
-      <w:r>
-        <w:fldChar w:fldCharType="begin"/>
-      </w:r>
-      <w:r>
-        <w:instrText xml:space="preserve"> SEQ Figura \* ARABIC </w:instrText>
-      </w:r>
-      <w:r>
-        <w:fldChar w:fldCharType="separate"/>
-      </w:r>
-      <w:r>
-        <w:t>2</w:t>
-      </w:r>
-      <w:r>
-        <w:fldChar w:fldCharType="end"/>
-      </w:r>
+      <w:fldSimple w:instr=" SEQ Figura \* ARABIC ">
+        <w:r>
+          <w:t>2</w:t>
+        </w:r>
+      </w:fldSimple>
       <w:r>
         <w:t xml:space="preserve"> - </w:t>
       </w:r>
@@ -8364,14 +8353,14 @@
           <w:lang w:val="it-CH"/>
         </w:rPr>
       </w:pPr>
-      <w:bookmarkStart w:id="11" w:name="_Toc194492664"/>
+      <w:bookmarkStart w:id="12" w:name="_Toc194492664"/>
       <w:r>
         <w:rPr>
           <w:lang w:val="it-CH"/>
         </w:rPr>
         <w:t>Analisi dei mezzi</w:t>
       </w:r>
-      <w:bookmarkEnd w:id="11"/>
+      <w:bookmarkEnd w:id="12"/>
     </w:p>
     <w:p>
       <w:pPr>
@@ -8380,16 +8369,16 @@
           <w:lang w:val="it-CH"/>
         </w:rPr>
       </w:pPr>
-      <w:bookmarkStart w:id="12" w:name="_Toc413411419"/>
-      <w:bookmarkStart w:id="13" w:name="_Toc194492665"/>
+      <w:bookmarkStart w:id="13" w:name="_Toc413411419"/>
+      <w:bookmarkStart w:id="14" w:name="_Toc194492665"/>
       <w:r>
         <w:rPr>
           <w:lang w:val="it-CH"/>
         </w:rPr>
         <w:t>Software</w:t>
       </w:r>
-      <w:bookmarkEnd w:id="12"/>
       <w:bookmarkEnd w:id="13"/>
+      <w:bookmarkEnd w:id="14"/>
     </w:p>
     <w:p>
       <w:pPr>
@@ -8467,16 +8456,16 @@
           <w:lang w:val="it-CH"/>
         </w:rPr>
       </w:pPr>
-      <w:bookmarkStart w:id="14" w:name="_Toc413411420"/>
-      <w:bookmarkStart w:id="15" w:name="_Toc194492666"/>
+      <w:bookmarkStart w:id="15" w:name="_Toc413411420"/>
+      <w:bookmarkStart w:id="16" w:name="_Toc194492666"/>
       <w:r>
         <w:rPr>
           <w:lang w:val="it-CH"/>
         </w:rPr>
         <w:t>Hardware</w:t>
       </w:r>
-      <w:bookmarkEnd w:id="14"/>
       <w:bookmarkEnd w:id="15"/>
+      <w:bookmarkEnd w:id="16"/>
     </w:p>
     <w:p>
       <w:r>
@@ -8570,14 +8559,14 @@
       <w:pPr>
         <w:pStyle w:val="Titolo1"/>
       </w:pPr>
-      <w:bookmarkStart w:id="16" w:name="_Toc429059808"/>
-      <w:bookmarkStart w:id="17" w:name="_Toc194492667"/>
+      <w:bookmarkStart w:id="17" w:name="_Toc429059808"/>
+      <w:bookmarkStart w:id="18" w:name="_Toc194492667"/>
       <w:r>
         <w:lastRenderedPageBreak/>
         <w:t>Progettazione</w:t>
       </w:r>
-      <w:bookmarkEnd w:id="16"/>
       <w:bookmarkEnd w:id="17"/>
+      <w:bookmarkEnd w:id="18"/>
     </w:p>
     <w:p>
       <w:pPr>
@@ -8586,16 +8575,16 @@
           <w:lang w:val="it-CH"/>
         </w:rPr>
       </w:pPr>
-      <w:bookmarkStart w:id="18" w:name="_Toc429059809"/>
-      <w:bookmarkStart w:id="19" w:name="_Toc194492668"/>
+      <w:bookmarkStart w:id="19" w:name="_Toc429059809"/>
+      <w:bookmarkStart w:id="20" w:name="_Toc194492668"/>
       <w:r>
         <w:rPr>
           <w:lang w:val="it-CH"/>
         </w:rPr>
         <w:t>Design dell’architettura del sistema</w:t>
       </w:r>
-      <w:bookmarkEnd w:id="18"/>
       <w:bookmarkEnd w:id="19"/>
+      <w:bookmarkEnd w:id="20"/>
     </w:p>
     <w:p>
       <w:pPr>
@@ -8650,21 +8639,11 @@
       <w:r>
         <w:t xml:space="preserve">Figura </w:t>
       </w:r>
-      <w:r>
-        <w:fldChar w:fldCharType="begin"/>
-      </w:r>
-      <w:r>
-        <w:instrText xml:space="preserve"> SEQ Figura \* ARABIC </w:instrText>
-      </w:r>
-      <w:r>
-        <w:fldChar w:fldCharType="separate"/>
-      </w:r>
-      <w:r>
-        <w:t>3</w:t>
-      </w:r>
-      <w:r>
-        <w:fldChar w:fldCharType="end"/>
-      </w:r>
+      <w:fldSimple w:instr=" SEQ Figura \* ARABIC ">
+        <w:r>
+          <w:t>3</w:t>
+        </w:r>
+      </w:fldSimple>
       <w:r>
         <w:t xml:space="preserve"> - Diagramma Architettura</w:t>
       </w:r>
@@ -8716,7 +8695,7 @@
           <w:lang w:val="it-CH"/>
         </w:rPr>
       </w:pPr>
-      <w:bookmarkStart w:id="20" w:name="_Toc194492669"/>
+      <w:bookmarkStart w:id="21" w:name="_Toc194492669"/>
       <w:proofErr w:type="spellStart"/>
       <w:r>
         <w:rPr>
@@ -8724,7 +8703,7 @@
         </w:rPr>
         <w:t>Swimlanes</w:t>
       </w:r>
-      <w:bookmarkEnd w:id="20"/>
+      <w:bookmarkEnd w:id="21"/>
       <w:proofErr w:type="spellEnd"/>
     </w:p>
     <w:p>
@@ -8781,21 +8760,11 @@
       <w:r>
         <w:t xml:space="preserve">Figura </w:t>
       </w:r>
-      <w:r>
-        <w:fldChar w:fldCharType="begin"/>
-      </w:r>
-      <w:r>
-        <w:instrText xml:space="preserve"> SEQ Figura \* ARABIC </w:instrText>
-      </w:r>
-      <w:r>
-        <w:fldChar w:fldCharType="separate"/>
-      </w:r>
-      <w:r>
-        <w:t>4</w:t>
-      </w:r>
-      <w:r>
-        <w:fldChar w:fldCharType="end"/>
-      </w:r>
+      <w:fldSimple w:instr=" SEQ Figura \* ARABIC ">
+        <w:r>
+          <w:t>4</w:t>
+        </w:r>
+      </w:fldSimple>
       <w:r>
         <w:t xml:space="preserve"> - </w:t>
       </w:r>
@@ -8907,24 +8876,11 @@
       <w:r>
         <w:t xml:space="preserve">Figura </w:t>
       </w:r>
-      <w:r>
-        <w:fldChar w:fldCharType="begin"/>
-      </w:r>
-      <w:r>
-        <w:instrText xml:space="preserve"> SEQ Figura \</w:instrText>
-      </w:r>
-      <w:r>
-        <w:instrText xml:space="preserve">* ARABIC </w:instrText>
-      </w:r>
-      <w:r>
-        <w:fldChar w:fldCharType="separate"/>
-      </w:r>
-      <w:r>
-        <w:t>5</w:t>
-      </w:r>
-      <w:r>
-        <w:fldChar w:fldCharType="end"/>
-      </w:r>
+      <w:fldSimple w:instr=" SEQ Figura \* ARABIC ">
+        <w:r>
+          <w:t>5</w:t>
+        </w:r>
+      </w:fldSimple>
       <w:r>
         <w:t xml:space="preserve"> - </w:t>
       </w:r>
@@ -9032,21 +8988,11 @@
       <w:r>
         <w:t xml:space="preserve">Figura </w:t>
       </w:r>
-      <w:r>
-        <w:fldChar w:fldCharType="begin"/>
-      </w:r>
-      <w:r>
-        <w:instrText xml:space="preserve"> SEQ Figura \* ARABIC </w:instrText>
-      </w:r>
-      <w:r>
-        <w:fldChar w:fldCharType="separate"/>
-      </w:r>
-      <w:r>
-        <w:t>6</w:t>
-      </w:r>
-      <w:r>
-        <w:fldChar w:fldCharType="end"/>
-      </w:r>
+      <w:fldSimple w:instr=" SEQ Figura \* ARABIC ">
+        <w:r>
+          <w:t>6</w:t>
+        </w:r>
+      </w:fldSimple>
       <w:r>
         <w:t xml:space="preserve"> - </w:t>
       </w:r>
@@ -9105,8 +9051,8 @@
           <w:lang w:val="it-CH"/>
         </w:rPr>
       </w:pPr>
-      <w:bookmarkStart w:id="21" w:name="_Toc429059810"/>
-      <w:bookmarkStart w:id="22" w:name="_Toc194492670"/>
+      <w:bookmarkStart w:id="22" w:name="_Toc429059810"/>
+      <w:bookmarkStart w:id="23" w:name="_Toc194492670"/>
       <w:r>
         <w:rPr>
           <w:lang w:val="it-CH"/>
@@ -9114,8 +9060,8 @@
         <w:lastRenderedPageBreak/>
         <w:t>Design dei dati e database</w:t>
       </w:r>
-      <w:bookmarkEnd w:id="21"/>
       <w:bookmarkEnd w:id="22"/>
+      <w:bookmarkEnd w:id="23"/>
     </w:p>
     <w:p>
       <w:pPr>
@@ -9171,21 +9117,11 @@
       <w:r>
         <w:t xml:space="preserve">Figura </w:t>
       </w:r>
-      <w:r>
-        <w:fldChar w:fldCharType="begin"/>
-      </w:r>
-      <w:r>
-        <w:instrText xml:space="preserve"> SEQ Figura \* ARABIC </w:instrText>
-      </w:r>
-      <w:r>
-        <w:fldChar w:fldCharType="separate"/>
-      </w:r>
-      <w:r>
-        <w:t>7</w:t>
-      </w:r>
-      <w:r>
-        <w:fldChar w:fldCharType="end"/>
-      </w:r>
+      <w:fldSimple w:instr=" SEQ Figura \* ARABIC ">
+        <w:r>
+          <w:t>7</w:t>
+        </w:r>
+      </w:fldSimple>
       <w:r>
         <w:t xml:space="preserve"> - Diagramma Classi</w:t>
       </w:r>
@@ -9267,16 +9203,16 @@
           <w:lang w:val="it-CH"/>
         </w:rPr>
       </w:pPr>
-      <w:bookmarkStart w:id="23" w:name="_Toc429059811"/>
-      <w:bookmarkStart w:id="24" w:name="_Toc194492671"/>
+      <w:bookmarkStart w:id="24" w:name="_Toc429059811"/>
+      <w:bookmarkStart w:id="25" w:name="_Toc194492671"/>
       <w:r>
         <w:rPr>
           <w:lang w:val="it-CH"/>
         </w:rPr>
         <w:t>Design delle interfacce</w:t>
       </w:r>
-      <w:bookmarkEnd w:id="23"/>
       <w:bookmarkEnd w:id="24"/>
+      <w:bookmarkEnd w:id="25"/>
     </w:p>
     <w:p>
       <w:pPr>
@@ -9293,14 +9229,14 @@
           <w:lang w:val="it-CH"/>
         </w:rPr>
       </w:pPr>
-      <w:bookmarkStart w:id="25" w:name="_Toc194492672"/>
+      <w:bookmarkStart w:id="26" w:name="_Toc194492672"/>
       <w:r>
         <w:rPr>
           <w:lang w:val="it-CH"/>
         </w:rPr>
         <w:t>Registrazione utente</w:t>
       </w:r>
-      <w:bookmarkEnd w:id="25"/>
+      <w:bookmarkEnd w:id="26"/>
     </w:p>
     <w:p>
       <w:pPr>
@@ -9367,21 +9303,11 @@
       <w:r>
         <w:t xml:space="preserve">Figura </w:t>
       </w:r>
-      <w:r>
-        <w:fldChar w:fldCharType="begin"/>
-      </w:r>
-      <w:r>
-        <w:instrText xml:space="preserve"> SEQ Figura \* ARABIC </w:instrText>
-      </w:r>
-      <w:r>
-        <w:fldChar w:fldCharType="separate"/>
-      </w:r>
-      <w:r>
-        <w:t>8</w:t>
-      </w:r>
-      <w:r>
-        <w:fldChar w:fldCharType="end"/>
-      </w:r>
+      <w:fldSimple w:instr=" SEQ Figura \* ARABIC ">
+        <w:r>
+          <w:t>8</w:t>
+        </w:r>
+      </w:fldSimple>
       <w:r>
         <w:t xml:space="preserve"> - Design registrazione utente</w:t>
       </w:r>
@@ -9443,7 +9369,7 @@
           <w:lang w:val="it-CH"/>
         </w:rPr>
       </w:pPr>
-      <w:bookmarkStart w:id="26" w:name="_Toc194492673"/>
+      <w:bookmarkStart w:id="27" w:name="_Toc194492673"/>
       <w:r>
         <w:rPr>
           <w:lang w:val="it-CH"/>
@@ -9451,7 +9377,7 @@
         <w:lastRenderedPageBreak/>
         <w:t>Login utente</w:t>
       </w:r>
-      <w:bookmarkEnd w:id="26"/>
+      <w:bookmarkEnd w:id="27"/>
     </w:p>
     <w:p>
       <w:pPr>
@@ -9519,21 +9445,11 @@
       <w:r>
         <w:t xml:space="preserve">Figura </w:t>
       </w:r>
-      <w:r>
-        <w:fldChar w:fldCharType="begin"/>
-      </w:r>
-      <w:r>
-        <w:instrText xml:space="preserve"> SEQ Figura \* ARABIC </w:instrText>
-      </w:r>
-      <w:r>
-        <w:fldChar w:fldCharType="separate"/>
-      </w:r>
-      <w:r>
-        <w:t>9</w:t>
-      </w:r>
-      <w:r>
-        <w:fldChar w:fldCharType="end"/>
-      </w:r>
+      <w:fldSimple w:instr=" SEQ Figura \* ARABIC ">
+        <w:r>
+          <w:t>9</w:t>
+        </w:r>
+      </w:fldSimple>
       <w:r>
         <w:t xml:space="preserve"> - Design login utente</w:t>
       </w:r>
@@ -9562,7 +9478,7 @@
           <w:lang w:val="it-CH"/>
         </w:rPr>
       </w:pPr>
-      <w:bookmarkStart w:id="27" w:name="_Toc194492674"/>
+      <w:bookmarkStart w:id="28" w:name="_Toc194492674"/>
       <w:r>
         <w:rPr>
           <w:lang w:val="it-CH"/>
@@ -9570,7 +9486,7 @@
         <w:lastRenderedPageBreak/>
         <w:t>Home</w:t>
       </w:r>
-      <w:bookmarkEnd w:id="27"/>
+      <w:bookmarkEnd w:id="28"/>
     </w:p>
     <w:p>
       <w:pPr>
@@ -9637,24 +9553,11 @@
       <w:r>
         <w:t xml:space="preserve">Figura </w:t>
       </w:r>
-      <w:r>
-        <w:fldChar w:fldCharType="begin"/>
-      </w:r>
-      <w:r>
-        <w:instrText xml:space="preserve"> SEQ Figura </w:instrText>
-      </w:r>
-      <w:r>
-        <w:instrText xml:space="preserve">\* ARABIC </w:instrText>
-      </w:r>
-      <w:r>
-        <w:fldChar w:fldCharType="separate"/>
-      </w:r>
-      <w:r>
-        <w:t>10</w:t>
-      </w:r>
-      <w:r>
-        <w:fldChar w:fldCharType="end"/>
-      </w:r>
+      <w:fldSimple w:instr=" SEQ Figura \* ARABIC ">
+        <w:r>
+          <w:t>10</w:t>
+        </w:r>
+      </w:fldSimple>
       <w:r>
         <w:t xml:space="preserve"> - Design home</w:t>
       </w:r>
@@ -9692,7 +9595,7 @@
           <w:lang w:val="it-CH"/>
         </w:rPr>
       </w:pPr>
-      <w:bookmarkStart w:id="28" w:name="_Toc194492675"/>
+      <w:bookmarkStart w:id="29" w:name="_Toc194492675"/>
       <w:r>
         <w:rPr>
           <w:lang w:val="it-CH"/>
@@ -9700,7 +9603,7 @@
         <w:lastRenderedPageBreak/>
         <w:t>Creazione nota</w:t>
       </w:r>
-      <w:bookmarkEnd w:id="28"/>
+      <w:bookmarkEnd w:id="29"/>
     </w:p>
     <w:p>
       <w:pPr>
@@ -9767,21 +9670,11 @@
       <w:r>
         <w:t xml:space="preserve">Figura </w:t>
       </w:r>
-      <w:r>
-        <w:fldChar w:fldCharType="begin"/>
-      </w:r>
-      <w:r>
-        <w:instrText xml:space="preserve"> SEQ Figura \* ARABIC </w:instrText>
-      </w:r>
-      <w:r>
-        <w:fldChar w:fldCharType="separate"/>
-      </w:r>
-      <w:r>
-        <w:t>11</w:t>
-      </w:r>
-      <w:r>
-        <w:fldChar w:fldCharType="end"/>
-      </w:r>
+      <w:fldSimple w:instr=" SEQ Figura \* ARABIC ">
+        <w:r>
+          <w:t>11</w:t>
+        </w:r>
+      </w:fldSimple>
       <w:r>
         <w:t xml:space="preserve"> - Design creazione nota</w:t>
       </w:r>
@@ -9842,7 +9735,7 @@
           <w:lang w:val="it-CH"/>
         </w:rPr>
       </w:pPr>
-      <w:bookmarkStart w:id="29" w:name="_Toc194492676"/>
+      <w:bookmarkStart w:id="30" w:name="_Toc194492676"/>
       <w:r>
         <w:rPr>
           <w:lang w:val="it-CH"/>
@@ -9850,7 +9743,7 @@
         <w:lastRenderedPageBreak/>
         <w:t>Visualizzazione note</w:t>
       </w:r>
-      <w:bookmarkEnd w:id="29"/>
+      <w:bookmarkEnd w:id="30"/>
     </w:p>
     <w:p>
       <w:pPr>
@@ -9917,21 +9810,11 @@
       <w:r>
         <w:t xml:space="preserve">Figura </w:t>
       </w:r>
-      <w:r>
-        <w:fldChar w:fldCharType="begin"/>
-      </w:r>
-      <w:r>
-        <w:instrText xml:space="preserve"> SEQ Figura \* ARABIC </w:instrText>
-      </w:r>
-      <w:r>
-        <w:fldChar w:fldCharType="separate"/>
-      </w:r>
-      <w:r>
-        <w:t>12</w:t>
-      </w:r>
-      <w:r>
-        <w:fldChar w:fldCharType="end"/>
-      </w:r>
+      <w:fldSimple w:instr=" SEQ Figura \* ARABIC ">
+        <w:r>
+          <w:t>12</w:t>
+        </w:r>
+      </w:fldSimple>
       <w:r>
         <w:t xml:space="preserve"> - Design visualizzazione note</w:t>
       </w:r>
@@ -9972,16 +9855,16 @@
           <w:lang w:val="it-CH"/>
         </w:rPr>
       </w:pPr>
-      <w:bookmarkStart w:id="30" w:name="_Toc429059812"/>
-      <w:bookmarkStart w:id="31" w:name="_Toc194492677"/>
+      <w:bookmarkStart w:id="31" w:name="_Toc429059812"/>
+      <w:bookmarkStart w:id="32" w:name="_Toc194492677"/>
       <w:r>
         <w:rPr>
           <w:lang w:val="it-CH"/>
         </w:rPr>
         <w:t>Design procedurale</w:t>
       </w:r>
-      <w:bookmarkEnd w:id="30"/>
       <w:bookmarkEnd w:id="31"/>
+      <w:bookmarkEnd w:id="32"/>
     </w:p>
     <w:p>
       <w:r>
@@ -10067,14 +9950,14 @@
           <w:bottom w:val="single" w:sz="4" w:space="1" w:color="auto"/>
         </w:pBdr>
       </w:pPr>
-      <w:bookmarkStart w:id="32" w:name="_Toc461179222"/>
-      <w:bookmarkStart w:id="33" w:name="_Toc194492678"/>
+      <w:bookmarkStart w:id="33" w:name="_Toc461179222"/>
+      <w:bookmarkStart w:id="34" w:name="_Toc194492678"/>
       <w:r>
         <w:lastRenderedPageBreak/>
         <w:t>Implementazione</w:t>
       </w:r>
-      <w:bookmarkEnd w:id="32"/>
       <w:bookmarkEnd w:id="33"/>
+      <w:bookmarkEnd w:id="34"/>
     </w:p>
     <w:p>
       <w:r>
@@ -10139,13 +10022,13 @@
       <w:pPr>
         <w:pStyle w:val="Titolo1"/>
       </w:pPr>
-      <w:bookmarkStart w:id="34" w:name="_Toc461179223"/>
-      <w:bookmarkStart w:id="35" w:name="_Toc194492679"/>
+      <w:bookmarkStart w:id="35" w:name="_Toc461179223"/>
+      <w:bookmarkStart w:id="36" w:name="_Toc194492679"/>
       <w:r>
         <w:t>Test</w:t>
       </w:r>
-      <w:bookmarkEnd w:id="34"/>
       <w:bookmarkEnd w:id="35"/>
+      <w:bookmarkEnd w:id="36"/>
     </w:p>
     <w:p>
       <w:pPr>
@@ -10154,16 +10037,16 @@
           <w:lang w:val="it-CH"/>
         </w:rPr>
       </w:pPr>
-      <w:bookmarkStart w:id="36" w:name="_Toc461179224"/>
-      <w:bookmarkStart w:id="37" w:name="_Toc194492680"/>
+      <w:bookmarkStart w:id="37" w:name="_Toc461179224"/>
+      <w:bookmarkStart w:id="38" w:name="_Toc194492680"/>
       <w:r>
         <w:rPr>
           <w:lang w:val="it-CH"/>
         </w:rPr>
         <w:t>Protocollo di test</w:t>
       </w:r>
-      <w:bookmarkEnd w:id="36"/>
       <w:bookmarkEnd w:id="37"/>
+      <w:bookmarkEnd w:id="38"/>
     </w:p>
     <w:p>
       <w:r>
@@ -10825,7 +10708,7 @@
                 <w:lang w:val="it-CH"/>
               </w:rPr>
             </w:pPr>
-            <w:bookmarkStart w:id="38" w:name="_Toc461179225"/>
+            <w:bookmarkStart w:id="39" w:name="_Toc461179225"/>
             <w:r>
               <w:rPr>
                 <w:b/>
@@ -17815,15 +17698,15 @@
           <w:lang w:val="it-CH"/>
         </w:rPr>
       </w:pPr>
-      <w:bookmarkStart w:id="39" w:name="_Toc194492681"/>
+      <w:bookmarkStart w:id="40" w:name="_Toc194492681"/>
       <w:r>
         <w:rPr>
           <w:lang w:val="it-CH"/>
         </w:rPr>
         <w:t>Risultati test</w:t>
       </w:r>
-      <w:bookmarkEnd w:id="38"/>
       <w:bookmarkEnd w:id="39"/>
+      <w:bookmarkEnd w:id="40"/>
     </w:p>
     <w:p>
       <w:r>
@@ -17837,23 +17720,21 @@
           <w:lang w:val="it-CH"/>
         </w:rPr>
       </w:pPr>
-      <w:bookmarkStart w:id="40" w:name="_Toc461179226"/>
-      <w:bookmarkStart w:id="41" w:name="_Toc194492682"/>
+      <w:bookmarkStart w:id="41" w:name="_Toc461179226"/>
+      <w:bookmarkStart w:id="42" w:name="_Toc194492682"/>
       <w:r>
         <w:rPr>
           <w:lang w:val="it-CH"/>
         </w:rPr>
         <w:t>Mancanze/limitazioni conosciute</w:t>
       </w:r>
-      <w:bookmarkEnd w:id="40"/>
       <w:bookmarkEnd w:id="41"/>
+      <w:bookmarkEnd w:id="42"/>
     </w:p>
     <w:p>
       <w:r>
         <w:t>Era progettato una registrazione audio, ma dato che il progetto era da fare in 3 inizialmente, abbiamo ottimizzato le attività e la registrazione dell’audio per far meglio gli altri lavori l’abbiamo eliminata.</w:t>
       </w:r>
-      <w:bookmarkStart w:id="42" w:name="_GoBack"/>
-      <w:bookmarkEnd w:id="42"/>
     </w:p>
     <w:p>
       <w:pPr>
@@ -18639,27 +18520,14 @@
     <w:r>
       <w:tab/>
     </w:r>
-    <w:r>
-      <w:fldChar w:fldCharType="begin"/>
-    </w:r>
-    <w:r>
-      <w:instrText xml:space="preserve"> FILENAME \* MERGEFORMAT </w:instrText>
-    </w:r>
-    <w:r>
-      <w:fldChar w:fldCharType="separate"/>
-    </w:r>
-    <w:r>
-      <w:rPr>
-        <w:noProof/>
-      </w:rPr>
-      <w:t>Documentazione_CasaNote.docx</w:t>
-    </w:r>
-    <w:r>
-      <w:rPr>
-        <w:noProof/>
-      </w:rPr>
-      <w:fldChar w:fldCharType="end"/>
-    </w:r>
+    <w:fldSimple w:instr=" FILENAME \* MERGEFORMAT ">
+      <w:r>
+        <w:rPr>
+          <w:noProof/>
+        </w:rPr>
+        <w:t>Documentazione_CasaNote.docx</w:t>
+      </w:r>
+    </w:fldSimple>
     <w:r>
       <w:tab/>
       <w:t xml:space="preserve">Versione: </w:t>
@@ -18677,7 +18545,7 @@
       <w:rPr>
         <w:noProof/>
       </w:rPr>
-      <w:t>30.04.2025</w:t>
+      <w:t>07.05.2025</w:t>
     </w:r>
     <w:r>
       <w:fldChar w:fldCharType="end"/>
@@ -18995,27 +18863,14 @@
     <w:r>
       <w:tab/>
     </w:r>
-    <w:r>
-      <w:fldChar w:fldCharType="begin"/>
-    </w:r>
-    <w:r>
-      <w:instrText xml:space="preserve"> FILENAME \* MERGEFORMAT </w:instrText>
-    </w:r>
-    <w:r>
-      <w:fldChar w:fldCharType="separate"/>
-    </w:r>
-    <w:r>
-      <w:rPr>
-        <w:noProof/>
-      </w:rPr>
-      <w:t>Documentazione_CasaNote.docx</w:t>
-    </w:r>
-    <w:r>
-      <w:rPr>
-        <w:noProof/>
-      </w:rPr>
-      <w:fldChar w:fldCharType="end"/>
-    </w:r>
+    <w:fldSimple w:instr=" FILENAME \* MERGEFORMAT ">
+      <w:r>
+        <w:rPr>
+          <w:noProof/>
+        </w:rPr>
+        <w:t>Documentazione_CasaNote.docx</w:t>
+      </w:r>
+    </w:fldSimple>
     <w:r>
       <w:tab/>
       <w:t xml:space="preserve">Versione: </w:t>
@@ -19033,7 +18888,7 @@
       <w:rPr>
         <w:noProof/>
       </w:rPr>
-      <w:t>30.04.2025</w:t>
+      <w:t>07.05.2025</w:t>
     </w:r>
     <w:r>
       <w:fldChar w:fldCharType="end"/>
@@ -19082,27 +18937,14 @@
     <w:r>
       <w:tab/>
     </w:r>
-    <w:r>
-      <w:fldChar w:fldCharType="begin"/>
-    </w:r>
-    <w:r>
-      <w:instrText xml:space="preserve"> FILENAME \* MERGEFORMAT </w:instrText>
-    </w:r>
-    <w:r>
-      <w:fldChar w:fldCharType="separate"/>
-    </w:r>
-    <w:r>
-      <w:rPr>
-        <w:noProof/>
-      </w:rPr>
-      <w:t>Documentazione_CasaNote.docx</w:t>
-    </w:r>
-    <w:r>
-      <w:rPr>
-        <w:noProof/>
-      </w:rPr>
-      <w:fldChar w:fldCharType="end"/>
-    </w:r>
+    <w:fldSimple w:instr=" FILENAME \* MERGEFORMAT ">
+      <w:r>
+        <w:rPr>
+          <w:noProof/>
+        </w:rPr>
+        <w:t>Documentazione_CasaNote.docx</w:t>
+      </w:r>
+    </w:fldSimple>
     <w:r>
       <w:tab/>
       <w:t xml:space="preserve">Versione: </w:t>
@@ -19120,7 +18962,7 @@
       <w:rPr>
         <w:noProof/>
       </w:rPr>
-      <w:t>30.04.2025</w:t>
+      <w:t>07.05.2025</w:t>
     </w:r>
     <w:r>
       <w:fldChar w:fldCharType="end"/>
@@ -25811,7 +25653,7 @@
 </file>
 
 <file path=customXml/itemProps1.xml><?xml version="1.0" encoding="utf-8"?>
-<ds:datastoreItem xmlns:ds="http://schemas.openxmlformats.org/officeDocument/2006/customXml" ds:itemID="{1229A931-64C9-406D-9B13-1C9BB13E9B5B}">
+<ds:datastoreItem xmlns:ds="http://schemas.openxmlformats.org/officeDocument/2006/customXml" ds:itemID="{CEB22BA2-1951-46BE-BE4B-5E1502DF3E34}">
   <ds:schemaRefs>
     <ds:schemaRef ds:uri="http://schemas.openxmlformats.org/officeDocument/2006/bibliography"/>
   </ds:schemaRefs>

</xml_diff>